<commit_message>
Whole Paper Complete With Evidence Document Updated!
</commit_message>
<xml_diff>
--- a/9618_s21_sf_41/06_9618_41_Confidential Source Files June 2021/06_9618_41_Confidential Source Files June 2021/evidence_Highbrow College_20260527.docx
+++ b/9618_s21_sf_41/06_9618_41_Confidential Source Files June 2021/06_9618_41_Confidential Source Files June 2021/evidence_Highbrow College_20260527.docx
@@ -14,8 +14,6 @@
           <w:rFonts w:ascii="Arial" w:hAnsi="Arial" w:cs="Arial"/>
         </w:rPr>
       </w:pPr>
-      <w:bookmarkStart w:id="0" w:name="_GoBack"/>
-      <w:bookmarkEnd w:id="0"/>
       <w:r>
         <w:rPr>
           <w:rFonts w:ascii="Arial" w:hAnsi="Arial" w:cs="Arial"/>
@@ -386,25 +384,7 @@
                 <w:lang w:val="en-US"/>
               </w:rPr>
               <w:br/>
-              <w:t xml:space="preserve">    def __</w:t>
-            </w:r>
-            <w:proofErr w:type="spellStart"/>
-            <w:r>
-              <w:rPr>
-                <w:rFonts w:ascii="Arial" w:hAnsi="Arial" w:cs="Arial"/>
-                <w:i/>
-                <w:lang w:val="en-US"/>
-              </w:rPr>
-              <w:t>init</w:t>
-            </w:r>
-            <w:proofErr w:type="spellEnd"/>
-            <w:r>
-              <w:rPr>
-                <w:rFonts w:ascii="Arial" w:hAnsi="Arial" w:cs="Arial"/>
-                <w:i/>
-                <w:lang w:val="en-US"/>
-              </w:rPr>
-              <w:t>_</w:t>
+              <w:t xml:space="preserve">    def __init_</w:t>
             </w:r>
             <w:proofErr w:type="gramStart"/>
             <w:r>
@@ -422,25 +402,16 @@
                 <w:i/>
                 <w:lang w:val="en-US"/>
               </w:rPr>
-              <w:t xml:space="preserve">self, data, </w:t>
-            </w:r>
-            <w:proofErr w:type="spellStart"/>
-            <w:r>
-              <w:rPr>
-                <w:rFonts w:ascii="Arial" w:hAnsi="Arial" w:cs="Arial"/>
-                <w:i/>
-                <w:lang w:val="en-US"/>
-              </w:rPr>
-              <w:t>next_node</w:t>
-            </w:r>
-            <w:proofErr w:type="spellEnd"/>
-            <w:r>
-              <w:rPr>
-                <w:rFonts w:ascii="Arial" w:hAnsi="Arial" w:cs="Arial"/>
-                <w:i/>
-                <w:lang w:val="en-US"/>
-              </w:rPr>
-              <w:t>):</w:t>
+              <w:t>self, data, next_node):</w:t>
+            </w:r>
+            <w:r>
+              <w:rPr>
+                <w:rFonts w:ascii="Arial" w:hAnsi="Arial" w:cs="Arial"/>
+                <w:i/>
+                <w:lang w:val="en-US"/>
+              </w:rPr>
+              <w:br/>
+              <w:t xml:space="preserve">        self.data = data</w:t>
             </w:r>
             <w:r>
               <w:rPr>
@@ -451,34 +422,6 @@
               <w:br/>
               <w:t xml:space="preserve">        </w:t>
             </w:r>
-            <w:proofErr w:type="spellStart"/>
-            <w:r>
-              <w:rPr>
-                <w:rFonts w:ascii="Arial" w:hAnsi="Arial" w:cs="Arial"/>
-                <w:i/>
-                <w:lang w:val="en-US"/>
-              </w:rPr>
-              <w:t>self.data</w:t>
-            </w:r>
-            <w:proofErr w:type="spellEnd"/>
-            <w:r>
-              <w:rPr>
-                <w:rFonts w:ascii="Arial" w:hAnsi="Arial" w:cs="Arial"/>
-                <w:i/>
-                <w:lang w:val="en-US"/>
-              </w:rPr>
-              <w:t xml:space="preserve"> = data</w:t>
-            </w:r>
-            <w:r>
-              <w:rPr>
-                <w:rFonts w:ascii="Arial" w:hAnsi="Arial" w:cs="Arial"/>
-                <w:i/>
-                <w:lang w:val="en-US"/>
-              </w:rPr>
-              <w:br/>
-              <w:t xml:space="preserve">        </w:t>
-            </w:r>
-            <w:proofErr w:type="spellStart"/>
             <w:proofErr w:type="gramStart"/>
             <w:r>
               <w:rPr>
@@ -488,7 +431,6 @@
               </w:rPr>
               <w:t>self.nextNode</w:t>
             </w:r>
-            <w:proofErr w:type="spellEnd"/>
             <w:proofErr w:type="gramEnd"/>
             <w:r>
               <w:rPr>
@@ -496,18 +438,8 @@
                 <w:i/>
                 <w:lang w:val="en-US"/>
               </w:rPr>
-              <w:t xml:space="preserve"> = </w:t>
-            </w:r>
-            <w:proofErr w:type="spellStart"/>
-            <w:r>
-              <w:rPr>
-                <w:rFonts w:ascii="Arial" w:hAnsi="Arial" w:cs="Arial"/>
-                <w:i/>
-                <w:lang w:val="en-US"/>
-              </w:rPr>
-              <w:t>next_node</w:t>
-            </w:r>
-            <w:proofErr w:type="spellEnd"/>
+              <w:t xml:space="preserve"> = next_node</w:t>
+            </w:r>
           </w:p>
           <w:p>
             <w:pPr>
@@ -590,75 +522,31 @@
                 <w:lang w:val="en-US"/>
               </w:rPr>
             </w:pPr>
-            <w:proofErr w:type="spellStart"/>
-            <w:r>
-              <w:rPr>
-                <w:rFonts w:ascii="Arial" w:hAnsi="Arial" w:cs="Arial"/>
-                <w:i/>
-                <w:lang w:val="en-US"/>
-              </w:rPr>
-              <w:t>startPointer</w:t>
-            </w:r>
-            <w:proofErr w:type="spellEnd"/>
-            <w:r>
-              <w:rPr>
-                <w:rFonts w:ascii="Arial" w:hAnsi="Arial" w:cs="Arial"/>
-                <w:i/>
-                <w:lang w:val="en-US"/>
-              </w:rPr>
-              <w:t xml:space="preserve"> = 0</w:t>
-            </w:r>
-            <w:r>
-              <w:rPr>
-                <w:rFonts w:ascii="Arial" w:hAnsi="Arial" w:cs="Arial"/>
-                <w:i/>
-                <w:lang w:val="en-US"/>
-              </w:rPr>
-              <w:br/>
-            </w:r>
-            <w:proofErr w:type="spellStart"/>
-            <w:r>
-              <w:rPr>
-                <w:rFonts w:ascii="Arial" w:hAnsi="Arial" w:cs="Arial"/>
-                <w:i/>
-                <w:lang w:val="en-US"/>
-              </w:rPr>
-              <w:t>emptyList</w:t>
-            </w:r>
-            <w:proofErr w:type="spellEnd"/>
-            <w:r>
-              <w:rPr>
-                <w:rFonts w:ascii="Arial" w:hAnsi="Arial" w:cs="Arial"/>
-                <w:i/>
-                <w:lang w:val="en-US"/>
-              </w:rPr>
-              <w:t xml:space="preserve"> = 5</w:t>
-            </w:r>
-            <w:r>
-              <w:rPr>
-                <w:rFonts w:ascii="Arial" w:hAnsi="Arial" w:cs="Arial"/>
-                <w:i/>
-                <w:lang w:val="en-US"/>
-              </w:rPr>
-              <w:br/>
-            </w:r>
-            <w:proofErr w:type="spellStart"/>
-            <w:r>
-              <w:rPr>
-                <w:rFonts w:ascii="Arial" w:hAnsi="Arial" w:cs="Arial"/>
-                <w:i/>
-                <w:lang w:val="en-US"/>
-              </w:rPr>
-              <w:t>linkedList</w:t>
-            </w:r>
-            <w:proofErr w:type="spellEnd"/>
-            <w:r>
-              <w:rPr>
-                <w:rFonts w:ascii="Arial" w:hAnsi="Arial" w:cs="Arial"/>
-                <w:i/>
-                <w:lang w:val="en-US"/>
-              </w:rPr>
-              <w:t xml:space="preserve"> = [</w:t>
+            <w:r>
+              <w:rPr>
+                <w:rFonts w:ascii="Arial" w:hAnsi="Arial" w:cs="Arial"/>
+                <w:i/>
+                <w:lang w:val="en-US"/>
+              </w:rPr>
+              <w:t>startPointer = 0</w:t>
+            </w:r>
+            <w:r>
+              <w:rPr>
+                <w:rFonts w:ascii="Arial" w:hAnsi="Arial" w:cs="Arial"/>
+                <w:i/>
+                <w:lang w:val="en-US"/>
+              </w:rPr>
+              <w:br/>
+              <w:t>emptyList = 5</w:t>
+            </w:r>
+            <w:r>
+              <w:rPr>
+                <w:rFonts w:ascii="Arial" w:hAnsi="Arial" w:cs="Arial"/>
+                <w:i/>
+                <w:lang w:val="en-US"/>
+              </w:rPr>
+              <w:br/>
+              <w:t>linkedList = [</w:t>
             </w:r>
             <w:r>
               <w:rPr>
@@ -829,27 +717,7 @@
                 <w:sz w:val="28"/>
                 <w:szCs w:val="28"/>
               </w:rPr>
-              <w:t>(</w:t>
-            </w:r>
-            <w:proofErr w:type="spellStart"/>
-            <w:r>
-              <w:rPr>
-                <w:rFonts w:ascii="Arial" w:hAnsi="Arial" w:cs="Arial"/>
-                <w:b/>
-                <w:sz w:val="28"/>
-                <w:szCs w:val="28"/>
-              </w:rPr>
-              <w:t>i</w:t>
-            </w:r>
-            <w:proofErr w:type="spellEnd"/>
-            <w:r>
-              <w:rPr>
-                <w:rFonts w:ascii="Arial" w:hAnsi="Arial" w:cs="Arial"/>
-                <w:b/>
-                <w:sz w:val="28"/>
-                <w:szCs w:val="28"/>
-              </w:rPr>
-              <w:t>)</w:t>
+              <w:t>(i)</w:t>
             </w:r>
           </w:p>
         </w:tc>
@@ -876,104 +744,50 @@
               </w:rPr>
               <w:t xml:space="preserve">def </w:t>
             </w:r>
-            <w:proofErr w:type="spellStart"/>
-            <w:r>
-              <w:rPr>
-                <w:rFonts w:ascii="Arial" w:hAnsi="Arial" w:cs="Arial"/>
-                <w:i/>
-                <w:lang w:val="en-US"/>
-              </w:rPr>
-              <w:t>outputNodes</w:t>
-            </w:r>
-            <w:proofErr w:type="spellEnd"/>
-            <w:r>
-              <w:rPr>
-                <w:rFonts w:ascii="Arial" w:hAnsi="Arial" w:cs="Arial"/>
-                <w:i/>
-                <w:lang w:val="en-US"/>
-              </w:rPr>
-              <w:t>(</w:t>
-            </w:r>
-            <w:proofErr w:type="spellStart"/>
-            <w:r>
-              <w:rPr>
-                <w:rFonts w:ascii="Arial" w:hAnsi="Arial" w:cs="Arial"/>
-                <w:i/>
-                <w:lang w:val="en-US"/>
-              </w:rPr>
-              <w:t>linkedList</w:t>
-            </w:r>
-            <w:proofErr w:type="spellEnd"/>
-            <w:r>
-              <w:rPr>
-                <w:rFonts w:ascii="Arial" w:hAnsi="Arial" w:cs="Arial"/>
-                <w:i/>
-                <w:lang w:val="en-US"/>
-              </w:rPr>
-              <w:t xml:space="preserve">, </w:t>
-            </w:r>
-            <w:proofErr w:type="spellStart"/>
-            <w:r>
-              <w:rPr>
-                <w:rFonts w:ascii="Arial" w:hAnsi="Arial" w:cs="Arial"/>
-                <w:i/>
-                <w:lang w:val="en-US"/>
-              </w:rPr>
-              <w:t>startPointer</w:t>
-            </w:r>
-            <w:proofErr w:type="spellEnd"/>
-            <w:r>
-              <w:rPr>
-                <w:rFonts w:ascii="Arial" w:hAnsi="Arial" w:cs="Arial"/>
-                <w:i/>
-                <w:lang w:val="en-US"/>
-              </w:rPr>
-              <w:t>):</w:t>
-            </w:r>
-            <w:r>
-              <w:rPr>
-                <w:rFonts w:ascii="Arial" w:hAnsi="Arial" w:cs="Arial"/>
-                <w:i/>
-                <w:lang w:val="en-US"/>
-              </w:rPr>
-              <w:br/>
-              <w:t xml:space="preserve">    print(</w:t>
-            </w:r>
-            <w:proofErr w:type="spellStart"/>
-            <w:r>
-              <w:rPr>
-                <w:rFonts w:ascii="Arial" w:hAnsi="Arial" w:cs="Arial"/>
-                <w:i/>
-                <w:lang w:val="en-US"/>
-              </w:rPr>
-              <w:t>f"Outputting</w:t>
-            </w:r>
-            <w:proofErr w:type="spellEnd"/>
-            <w:r>
-              <w:rPr>
-                <w:rFonts w:ascii="Arial" w:hAnsi="Arial" w:cs="Arial"/>
-                <w:i/>
-                <w:lang w:val="en-US"/>
-              </w:rPr>
-              <w:t xml:space="preserve"> Nodes from {</w:t>
-            </w:r>
-            <w:proofErr w:type="spellStart"/>
-            <w:r>
-              <w:rPr>
-                <w:rFonts w:ascii="Arial" w:hAnsi="Arial" w:cs="Arial"/>
-                <w:i/>
-                <w:lang w:val="en-US"/>
-              </w:rPr>
-              <w:t>startPointer</w:t>
-            </w:r>
-            <w:proofErr w:type="spellEnd"/>
-            <w:r>
-              <w:rPr>
-                <w:rFonts w:ascii="Arial" w:hAnsi="Arial" w:cs="Arial"/>
-                <w:i/>
-                <w:lang w:val="en-US"/>
-              </w:rPr>
-              <w:t>}")</w:t>
+            <w:proofErr w:type="gramStart"/>
+            <w:r>
+              <w:rPr>
+                <w:rFonts w:ascii="Arial" w:hAnsi="Arial" w:cs="Arial"/>
+                <w:i/>
+                <w:lang w:val="en-US"/>
+              </w:rPr>
+              <w:t>outputNodes(</w:t>
+            </w:r>
+            <w:proofErr w:type="gramEnd"/>
+            <w:r>
+              <w:rPr>
+                <w:rFonts w:ascii="Arial" w:hAnsi="Arial" w:cs="Arial"/>
+                <w:i/>
+                <w:lang w:val="en-US"/>
+              </w:rPr>
+              <w:t>linkedList, startPointer):</w:t>
+            </w:r>
+            <w:r>
+              <w:rPr>
+                <w:rFonts w:ascii="Arial" w:hAnsi="Arial" w:cs="Arial"/>
+                <w:i/>
+                <w:lang w:val="en-US"/>
+              </w:rPr>
+              <w:br/>
+              <w:t xml:space="preserve">    </w:t>
+            </w:r>
+            <w:proofErr w:type="gramStart"/>
+            <w:r>
+              <w:rPr>
+                <w:rFonts w:ascii="Arial" w:hAnsi="Arial" w:cs="Arial"/>
+                <w:i/>
+                <w:lang w:val="en-US"/>
+              </w:rPr>
+              <w:t>print(</w:t>
+            </w:r>
+            <w:proofErr w:type="gramEnd"/>
+            <w:r>
+              <w:rPr>
+                <w:rFonts w:ascii="Arial" w:hAnsi="Arial" w:cs="Arial"/>
+                <w:i/>
+                <w:lang w:val="en-US"/>
+              </w:rPr>
+              <w:t>f"Outputting Nodes from {startPointer}")</w:t>
             </w:r>
             <w:r>
               <w:rPr>
@@ -992,124 +806,6 @@
               <w:br/>
               <w:t xml:space="preserve">    while </w:t>
             </w:r>
-            <w:proofErr w:type="spellStart"/>
-            <w:r>
-              <w:rPr>
-                <w:rFonts w:ascii="Arial" w:hAnsi="Arial" w:cs="Arial"/>
-                <w:i/>
-                <w:lang w:val="en-US"/>
-              </w:rPr>
-              <w:t>startPointer</w:t>
-            </w:r>
-            <w:proofErr w:type="spellEnd"/>
-            <w:r>
-              <w:rPr>
-                <w:rFonts w:ascii="Arial" w:hAnsi="Arial" w:cs="Arial"/>
-                <w:i/>
-                <w:lang w:val="en-US"/>
-              </w:rPr>
-              <w:t xml:space="preserve"> != -1:</w:t>
-            </w:r>
-            <w:r>
-              <w:rPr>
-                <w:rFonts w:ascii="Arial" w:hAnsi="Arial" w:cs="Arial"/>
-                <w:i/>
-                <w:lang w:val="en-US"/>
-              </w:rPr>
-              <w:br/>
-              <w:t xml:space="preserve">        print(</w:t>
-            </w:r>
-            <w:proofErr w:type="spellStart"/>
-            <w:r>
-              <w:rPr>
-                <w:rFonts w:ascii="Arial" w:hAnsi="Arial" w:cs="Arial"/>
-                <w:i/>
-                <w:lang w:val="en-US"/>
-              </w:rPr>
-              <w:t>linkedList</w:t>
-            </w:r>
-            <w:proofErr w:type="spellEnd"/>
-            <w:r>
-              <w:rPr>
-                <w:rFonts w:ascii="Arial" w:hAnsi="Arial" w:cs="Arial"/>
-                <w:i/>
-                <w:lang w:val="en-US"/>
-              </w:rPr>
-              <w:t>[</w:t>
-            </w:r>
-            <w:proofErr w:type="spellStart"/>
-            <w:r>
-              <w:rPr>
-                <w:rFonts w:ascii="Arial" w:hAnsi="Arial" w:cs="Arial"/>
-                <w:i/>
-                <w:lang w:val="en-US"/>
-              </w:rPr>
-              <w:t>startPointer</w:t>
-            </w:r>
-            <w:proofErr w:type="spellEnd"/>
-            <w:r>
-              <w:rPr>
-                <w:rFonts w:ascii="Arial" w:hAnsi="Arial" w:cs="Arial"/>
-                <w:i/>
-                <w:lang w:val="en-US"/>
-              </w:rPr>
-              <w:t>].data)</w:t>
-            </w:r>
-            <w:r>
-              <w:rPr>
-                <w:rFonts w:ascii="Arial" w:hAnsi="Arial" w:cs="Arial"/>
-                <w:i/>
-                <w:lang w:val="en-US"/>
-              </w:rPr>
-              <w:br/>
-              <w:t xml:space="preserve">        </w:t>
-            </w:r>
-            <w:proofErr w:type="spellStart"/>
-            <w:r>
-              <w:rPr>
-                <w:rFonts w:ascii="Arial" w:hAnsi="Arial" w:cs="Arial"/>
-                <w:i/>
-                <w:lang w:val="en-US"/>
-              </w:rPr>
-              <w:t>startPointer</w:t>
-            </w:r>
-            <w:proofErr w:type="spellEnd"/>
-            <w:r>
-              <w:rPr>
-                <w:rFonts w:ascii="Arial" w:hAnsi="Arial" w:cs="Arial"/>
-                <w:i/>
-                <w:lang w:val="en-US"/>
-              </w:rPr>
-              <w:t xml:space="preserve"> = </w:t>
-            </w:r>
-            <w:proofErr w:type="spellStart"/>
-            <w:r>
-              <w:rPr>
-                <w:rFonts w:ascii="Arial" w:hAnsi="Arial" w:cs="Arial"/>
-                <w:i/>
-                <w:lang w:val="en-US"/>
-              </w:rPr>
-              <w:t>linkedList</w:t>
-            </w:r>
-            <w:proofErr w:type="spellEnd"/>
-            <w:r>
-              <w:rPr>
-                <w:rFonts w:ascii="Arial" w:hAnsi="Arial" w:cs="Arial"/>
-                <w:i/>
-                <w:lang w:val="en-US"/>
-              </w:rPr>
-              <w:t>[</w:t>
-            </w:r>
-            <w:proofErr w:type="spellStart"/>
-            <w:r>
-              <w:rPr>
-                <w:rFonts w:ascii="Arial" w:hAnsi="Arial" w:cs="Arial"/>
-                <w:i/>
-                <w:lang w:val="en-US"/>
-              </w:rPr>
-              <w:t>startPointer</w:t>
-            </w:r>
-            <w:proofErr w:type="spellEnd"/>
             <w:proofErr w:type="gramStart"/>
             <w:r>
               <w:rPr>
@@ -1117,18 +813,44 @@
                 <w:i/>
                 <w:lang w:val="en-US"/>
               </w:rPr>
-              <w:t>].</w:t>
-            </w:r>
-            <w:proofErr w:type="spellStart"/>
-            <w:r>
-              <w:rPr>
-                <w:rFonts w:ascii="Arial" w:hAnsi="Arial" w:cs="Arial"/>
-                <w:i/>
-                <w:lang w:val="en-US"/>
-              </w:rPr>
-              <w:t>nextNode</w:t>
-            </w:r>
-            <w:proofErr w:type="spellEnd"/>
+              <w:t>startPointer !</w:t>
+            </w:r>
+            <w:proofErr w:type="gramEnd"/>
+            <w:r>
+              <w:rPr>
+                <w:rFonts w:ascii="Arial" w:hAnsi="Arial" w:cs="Arial"/>
+                <w:i/>
+                <w:lang w:val="en-US"/>
+              </w:rPr>
+              <w:t>= -1:</w:t>
+            </w:r>
+            <w:r>
+              <w:rPr>
+                <w:rFonts w:ascii="Arial" w:hAnsi="Arial" w:cs="Arial"/>
+                <w:i/>
+                <w:lang w:val="en-US"/>
+              </w:rPr>
+              <w:br/>
+              <w:t xml:space="preserve">        print(linkedList[startPointer].data)</w:t>
+            </w:r>
+            <w:r>
+              <w:rPr>
+                <w:rFonts w:ascii="Arial" w:hAnsi="Arial" w:cs="Arial"/>
+                <w:i/>
+                <w:lang w:val="en-US"/>
+              </w:rPr>
+              <w:br/>
+              <w:t xml:space="preserve">        startPointer = linkedList[startPointer</w:t>
+            </w:r>
+            <w:proofErr w:type="gramStart"/>
+            <w:r>
+              <w:rPr>
+                <w:rFonts w:ascii="Arial" w:hAnsi="Arial" w:cs="Arial"/>
+                <w:i/>
+                <w:lang w:val="en-US"/>
+              </w:rPr>
+              <w:t>].nextNode</w:t>
+            </w:r>
             <w:proofErr w:type="gramEnd"/>
           </w:p>
           <w:p>
@@ -1270,7 +992,7 @@
                   <v:path o:extrusionok="f" gradientshapeok="t" o:connecttype="rect"/>
                   <o:lock v:ext="edit" aspectratio="t"/>
                 </v:shapetype>
-                <v:shape id="Picture 1" o:spid="_x0000_i1027" type="#_x0000_t75" style="width:366.75pt;height:186.75pt;visibility:visible;mso-wrap-style:square">
+                <v:shape id="Picture 1" o:spid="_x0000_i1025" type="#_x0000_t75" style="width:366.75pt;height:186.75pt;visibility:visible;mso-wrap-style:square">
                   <v:imagedata r:id="rId6" o:title=""/>
                 </v:shape>
               </w:pict>
@@ -1334,27 +1056,7 @@
                 <w:sz w:val="28"/>
                 <w:szCs w:val="28"/>
               </w:rPr>
-              <w:t>Part 1(d)(</w:t>
-            </w:r>
-            <w:proofErr w:type="spellStart"/>
-            <w:r>
-              <w:rPr>
-                <w:rFonts w:ascii="Arial" w:hAnsi="Arial" w:cs="Arial"/>
-                <w:b/>
-                <w:sz w:val="28"/>
-                <w:szCs w:val="28"/>
-              </w:rPr>
-              <w:t>i</w:t>
-            </w:r>
-            <w:proofErr w:type="spellEnd"/>
-            <w:r>
-              <w:rPr>
-                <w:rFonts w:ascii="Arial" w:hAnsi="Arial" w:cs="Arial"/>
-                <w:b/>
-                <w:sz w:val="28"/>
-                <w:szCs w:val="28"/>
-              </w:rPr>
-              <w:t>)</w:t>
+              <w:t>Part 1(d)(i)</w:t>
             </w:r>
           </w:p>
         </w:tc>
@@ -1379,79 +1081,7 @@
                 <w:i/>
                 <w:lang w:val="en-US"/>
               </w:rPr>
-              <w:t xml:space="preserve">def </w:t>
-            </w:r>
-            <w:proofErr w:type="spellStart"/>
-            <w:r>
-              <w:rPr>
-                <w:rFonts w:ascii="Arial" w:hAnsi="Arial" w:cs="Arial"/>
-                <w:i/>
-                <w:lang w:val="en-US"/>
-              </w:rPr>
-              <w:t>addNode</w:t>
-            </w:r>
-            <w:proofErr w:type="spellEnd"/>
-            <w:r>
-              <w:rPr>
-                <w:rFonts w:ascii="Arial" w:hAnsi="Arial" w:cs="Arial"/>
-                <w:i/>
-                <w:lang w:val="en-US"/>
-              </w:rPr>
-              <w:t>(</w:t>
-            </w:r>
-            <w:proofErr w:type="spellStart"/>
-            <w:r>
-              <w:rPr>
-                <w:rFonts w:ascii="Arial" w:hAnsi="Arial" w:cs="Arial"/>
-                <w:i/>
-                <w:lang w:val="en-US"/>
-              </w:rPr>
-              <w:t>linkedList</w:t>
-            </w:r>
-            <w:proofErr w:type="spellEnd"/>
-            <w:r>
-              <w:rPr>
-                <w:rFonts w:ascii="Arial" w:hAnsi="Arial" w:cs="Arial"/>
-                <w:i/>
-                <w:lang w:val="en-US"/>
-              </w:rPr>
-              <w:t xml:space="preserve">, </w:t>
-            </w:r>
-            <w:proofErr w:type="spellStart"/>
-            <w:r>
-              <w:rPr>
-                <w:rFonts w:ascii="Arial" w:hAnsi="Arial" w:cs="Arial"/>
-                <w:i/>
-                <w:lang w:val="en-US"/>
-              </w:rPr>
-              <w:t>startPointer</w:t>
-            </w:r>
-            <w:proofErr w:type="spellEnd"/>
-            <w:r>
-              <w:rPr>
-                <w:rFonts w:ascii="Arial" w:hAnsi="Arial" w:cs="Arial"/>
-                <w:i/>
-                <w:lang w:val="en-US"/>
-              </w:rPr>
-              <w:t xml:space="preserve">, </w:t>
-            </w:r>
-            <w:proofErr w:type="spellStart"/>
-            <w:r>
-              <w:rPr>
-                <w:rFonts w:ascii="Arial" w:hAnsi="Arial" w:cs="Arial"/>
-                <w:i/>
-                <w:lang w:val="en-US"/>
-              </w:rPr>
-              <w:t>emptyList</w:t>
-            </w:r>
-            <w:proofErr w:type="spellEnd"/>
-            <w:r>
-              <w:rPr>
-                <w:rFonts w:ascii="Arial" w:hAnsi="Arial" w:cs="Arial"/>
-                <w:i/>
-                <w:lang w:val="en-US"/>
-              </w:rPr>
-              <w:t>):</w:t>
+              <w:t>def addNode(linkedList, startPointer, emptyList):</w:t>
             </w:r>
             <w:r>
               <w:rPr>
@@ -1495,206 +1125,42 @@
                 <w:lang w:val="en-US"/>
               </w:rPr>
               <w:br/>
-              <w:t xml:space="preserve">    while </w:t>
-            </w:r>
-            <w:proofErr w:type="spellStart"/>
-            <w:r>
-              <w:rPr>
-                <w:rFonts w:ascii="Arial" w:hAnsi="Arial" w:cs="Arial"/>
-                <w:i/>
-                <w:lang w:val="en-US"/>
-              </w:rPr>
-              <w:t>startPointer</w:t>
-            </w:r>
-            <w:proofErr w:type="spellEnd"/>
-            <w:r>
-              <w:rPr>
-                <w:rFonts w:ascii="Arial" w:hAnsi="Arial" w:cs="Arial"/>
-                <w:i/>
-                <w:lang w:val="en-US"/>
-              </w:rPr>
-              <w:t xml:space="preserve"> != -1:</w:t>
-            </w:r>
-            <w:r>
-              <w:rPr>
-                <w:rFonts w:ascii="Arial" w:hAnsi="Arial" w:cs="Arial"/>
-                <w:i/>
-                <w:lang w:val="en-US"/>
-              </w:rPr>
-              <w:br/>
-              <w:t xml:space="preserve">        </w:t>
-            </w:r>
-            <w:proofErr w:type="spellStart"/>
-            <w:r>
-              <w:rPr>
-                <w:rFonts w:ascii="Arial" w:hAnsi="Arial" w:cs="Arial"/>
-                <w:i/>
-                <w:lang w:val="en-US"/>
-              </w:rPr>
-              <w:t>prevPointer</w:t>
-            </w:r>
-            <w:proofErr w:type="spellEnd"/>
-            <w:r>
-              <w:rPr>
-                <w:rFonts w:ascii="Arial" w:hAnsi="Arial" w:cs="Arial"/>
-                <w:i/>
-                <w:lang w:val="en-US"/>
-              </w:rPr>
-              <w:t xml:space="preserve"> = </w:t>
-            </w:r>
-            <w:proofErr w:type="spellStart"/>
-            <w:r>
-              <w:rPr>
-                <w:rFonts w:ascii="Arial" w:hAnsi="Arial" w:cs="Arial"/>
-                <w:i/>
-                <w:lang w:val="en-US"/>
-              </w:rPr>
-              <w:t>startPointer</w:t>
-            </w:r>
-            <w:proofErr w:type="spellEnd"/>
-            <w:r>
-              <w:rPr>
-                <w:rFonts w:ascii="Arial" w:hAnsi="Arial" w:cs="Arial"/>
-                <w:i/>
-                <w:lang w:val="en-US"/>
-              </w:rPr>
-              <w:br/>
-              <w:t xml:space="preserve">        </w:t>
-            </w:r>
-            <w:proofErr w:type="spellStart"/>
-            <w:r>
-              <w:rPr>
-                <w:rFonts w:ascii="Arial" w:hAnsi="Arial" w:cs="Arial"/>
-                <w:i/>
-                <w:lang w:val="en-US"/>
-              </w:rPr>
-              <w:t>startPointer</w:t>
-            </w:r>
-            <w:proofErr w:type="spellEnd"/>
-            <w:r>
-              <w:rPr>
-                <w:rFonts w:ascii="Arial" w:hAnsi="Arial" w:cs="Arial"/>
-                <w:i/>
-                <w:lang w:val="en-US"/>
-              </w:rPr>
-              <w:t xml:space="preserve"> = </w:t>
-            </w:r>
-            <w:proofErr w:type="spellStart"/>
-            <w:r>
-              <w:rPr>
-                <w:rFonts w:ascii="Arial" w:hAnsi="Arial" w:cs="Arial"/>
-                <w:i/>
-                <w:lang w:val="en-US"/>
-              </w:rPr>
-              <w:t>linkedList</w:t>
-            </w:r>
-            <w:proofErr w:type="spellEnd"/>
-            <w:r>
-              <w:rPr>
-                <w:rFonts w:ascii="Arial" w:hAnsi="Arial" w:cs="Arial"/>
-                <w:i/>
-                <w:lang w:val="en-US"/>
-              </w:rPr>
-              <w:t>[</w:t>
-            </w:r>
-            <w:proofErr w:type="spellStart"/>
-            <w:r>
-              <w:rPr>
-                <w:rFonts w:ascii="Arial" w:hAnsi="Arial" w:cs="Arial"/>
-                <w:i/>
-                <w:lang w:val="en-US"/>
-              </w:rPr>
-              <w:t>startPointer</w:t>
-            </w:r>
-            <w:proofErr w:type="spellEnd"/>
-            <w:r>
-              <w:rPr>
-                <w:rFonts w:ascii="Arial" w:hAnsi="Arial" w:cs="Arial"/>
-                <w:i/>
-                <w:lang w:val="en-US"/>
-              </w:rPr>
-              <w:t>].</w:t>
-            </w:r>
-            <w:proofErr w:type="spellStart"/>
-            <w:r>
-              <w:rPr>
-                <w:rFonts w:ascii="Arial" w:hAnsi="Arial" w:cs="Arial"/>
-                <w:i/>
-                <w:lang w:val="en-US"/>
-              </w:rPr>
-              <w:t>nextNode</w:t>
-            </w:r>
-            <w:proofErr w:type="spellEnd"/>
-            <w:r>
-              <w:rPr>
-                <w:rFonts w:ascii="Arial" w:hAnsi="Arial" w:cs="Arial"/>
-                <w:i/>
-                <w:lang w:val="en-US"/>
-              </w:rPr>
-              <w:br/>
-            </w:r>
-            <w:r>
-              <w:rPr>
-                <w:rFonts w:ascii="Arial" w:hAnsi="Arial" w:cs="Arial"/>
-                <w:i/>
-                <w:lang w:val="en-US"/>
-              </w:rPr>
-              <w:br/>
-              <w:t xml:space="preserve">    while </w:t>
-            </w:r>
-            <w:proofErr w:type="spellStart"/>
-            <w:r>
-              <w:rPr>
-                <w:rFonts w:ascii="Arial" w:hAnsi="Arial" w:cs="Arial"/>
-                <w:i/>
-                <w:lang w:val="en-US"/>
-              </w:rPr>
-              <w:t>linkedList</w:t>
-            </w:r>
-            <w:proofErr w:type="spellEnd"/>
-            <w:r>
-              <w:rPr>
-                <w:rFonts w:ascii="Arial" w:hAnsi="Arial" w:cs="Arial"/>
-                <w:i/>
-                <w:lang w:val="en-US"/>
-              </w:rPr>
-              <w:t>[</w:t>
-            </w:r>
-            <w:proofErr w:type="spellStart"/>
-            <w:r>
-              <w:rPr>
-                <w:rFonts w:ascii="Arial" w:hAnsi="Arial" w:cs="Arial"/>
-                <w:i/>
-                <w:lang w:val="en-US"/>
-              </w:rPr>
-              <w:t>emptyList</w:t>
-            </w:r>
-            <w:proofErr w:type="spellEnd"/>
-            <w:r>
-              <w:rPr>
-                <w:rFonts w:ascii="Arial" w:hAnsi="Arial" w:cs="Arial"/>
-                <w:i/>
-                <w:lang w:val="en-US"/>
-              </w:rPr>
-              <w:t>].</w:t>
-            </w:r>
-            <w:proofErr w:type="spellStart"/>
-            <w:r>
-              <w:rPr>
-                <w:rFonts w:ascii="Arial" w:hAnsi="Arial" w:cs="Arial"/>
-                <w:i/>
-                <w:lang w:val="en-US"/>
-              </w:rPr>
-              <w:t>nextNode</w:t>
-            </w:r>
-            <w:proofErr w:type="spellEnd"/>
-            <w:r>
-              <w:rPr>
-                <w:rFonts w:ascii="Arial" w:hAnsi="Arial" w:cs="Arial"/>
-                <w:i/>
-                <w:lang w:val="en-US"/>
-              </w:rPr>
-              <w:t xml:space="preserve"> != -1:</w:t>
+              <w:t xml:space="preserve">    while startPointer != -1:</w:t>
+            </w:r>
+            <w:r>
+              <w:rPr>
+                <w:rFonts w:ascii="Arial" w:hAnsi="Arial" w:cs="Arial"/>
+                <w:i/>
+                <w:lang w:val="en-US"/>
+              </w:rPr>
+              <w:br/>
+              <w:t xml:space="preserve">        prevPointer = startPointer</w:t>
+            </w:r>
+            <w:r>
+              <w:rPr>
+                <w:rFonts w:ascii="Arial" w:hAnsi="Arial" w:cs="Arial"/>
+                <w:i/>
+                <w:lang w:val="en-US"/>
+              </w:rPr>
+              <w:br/>
+              <w:t xml:space="preserve">        startPointer = linkedList[startPointer].nextNode</w:t>
+            </w:r>
+            <w:r>
+              <w:rPr>
+                <w:rFonts w:ascii="Arial" w:hAnsi="Arial" w:cs="Arial"/>
+                <w:i/>
+                <w:lang w:val="en-US"/>
+              </w:rPr>
+              <w:br/>
+            </w:r>
+            <w:r>
+              <w:rPr>
+                <w:rFonts w:ascii="Arial" w:hAnsi="Arial" w:cs="Arial"/>
+                <w:i/>
+                <w:lang w:val="en-US"/>
+              </w:rPr>
+              <w:br/>
+              <w:t xml:space="preserve">    while linkedList[emptyList].nextNode != -1:</w:t>
             </w:r>
             <w:r>
               <w:rPr>
@@ -1712,215 +1178,43 @@
                 <w:lang w:val="en-US"/>
               </w:rPr>
               <w:br/>
-              <w:t xml:space="preserve">        </w:t>
-            </w:r>
-            <w:proofErr w:type="spellStart"/>
-            <w:r>
-              <w:rPr>
-                <w:rFonts w:ascii="Arial" w:hAnsi="Arial" w:cs="Arial"/>
-                <w:i/>
-                <w:lang w:val="en-US"/>
-              </w:rPr>
-              <w:t>linkedList</w:t>
-            </w:r>
-            <w:proofErr w:type="spellEnd"/>
-            <w:r>
-              <w:rPr>
-                <w:rFonts w:ascii="Arial" w:hAnsi="Arial" w:cs="Arial"/>
-                <w:i/>
-                <w:lang w:val="en-US"/>
-              </w:rPr>
-              <w:t>[</w:t>
-            </w:r>
-            <w:proofErr w:type="spellStart"/>
-            <w:r>
-              <w:rPr>
-                <w:rFonts w:ascii="Arial" w:hAnsi="Arial" w:cs="Arial"/>
-                <w:i/>
-                <w:lang w:val="en-US"/>
-              </w:rPr>
-              <w:t>emptyList</w:t>
-            </w:r>
-            <w:proofErr w:type="spellEnd"/>
-            <w:r>
-              <w:rPr>
-                <w:rFonts w:ascii="Arial" w:hAnsi="Arial" w:cs="Arial"/>
-                <w:i/>
-                <w:lang w:val="en-US"/>
-              </w:rPr>
-              <w:t>].data = data</w:t>
-            </w:r>
-            <w:r>
-              <w:rPr>
-                <w:rFonts w:ascii="Arial" w:hAnsi="Arial" w:cs="Arial"/>
-                <w:i/>
-                <w:lang w:val="en-US"/>
-              </w:rPr>
-              <w:br/>
-              <w:t xml:space="preserve">        </w:t>
-            </w:r>
-            <w:proofErr w:type="spellStart"/>
-            <w:r>
-              <w:rPr>
-                <w:rFonts w:ascii="Arial" w:hAnsi="Arial" w:cs="Arial"/>
-                <w:i/>
-                <w:lang w:val="en-US"/>
-              </w:rPr>
-              <w:t>linkedList</w:t>
-            </w:r>
-            <w:proofErr w:type="spellEnd"/>
-            <w:r>
-              <w:rPr>
-                <w:rFonts w:ascii="Arial" w:hAnsi="Arial" w:cs="Arial"/>
-                <w:i/>
-                <w:lang w:val="en-US"/>
-              </w:rPr>
-              <w:t>[</w:t>
-            </w:r>
-            <w:proofErr w:type="spellStart"/>
-            <w:r>
-              <w:rPr>
-                <w:rFonts w:ascii="Arial" w:hAnsi="Arial" w:cs="Arial"/>
-                <w:i/>
-                <w:lang w:val="en-US"/>
-              </w:rPr>
-              <w:t>emptyList</w:t>
-            </w:r>
-            <w:proofErr w:type="spellEnd"/>
-            <w:r>
-              <w:rPr>
-                <w:rFonts w:ascii="Arial" w:hAnsi="Arial" w:cs="Arial"/>
-                <w:i/>
-                <w:lang w:val="en-US"/>
-              </w:rPr>
-              <w:t>].</w:t>
-            </w:r>
-            <w:proofErr w:type="spellStart"/>
-            <w:r>
-              <w:rPr>
-                <w:rFonts w:ascii="Arial" w:hAnsi="Arial" w:cs="Arial"/>
-                <w:i/>
-                <w:lang w:val="en-US"/>
-              </w:rPr>
-              <w:t>nextNode</w:t>
-            </w:r>
-            <w:proofErr w:type="spellEnd"/>
-            <w:r>
-              <w:rPr>
-                <w:rFonts w:ascii="Arial" w:hAnsi="Arial" w:cs="Arial"/>
-                <w:i/>
-                <w:lang w:val="en-US"/>
-              </w:rPr>
-              <w:t xml:space="preserve"> = -1</w:t>
-            </w:r>
-            <w:r>
-              <w:rPr>
-                <w:rFonts w:ascii="Arial" w:hAnsi="Arial" w:cs="Arial"/>
-                <w:i/>
-                <w:lang w:val="en-US"/>
-              </w:rPr>
-              <w:br/>
-            </w:r>
-            <w:r>
-              <w:rPr>
-                <w:rFonts w:ascii="Arial" w:hAnsi="Arial" w:cs="Arial"/>
-                <w:i/>
-                <w:lang w:val="en-US"/>
-              </w:rPr>
-              <w:br/>
-              <w:t xml:space="preserve">        # updating to join </w:t>
-            </w:r>
-            <w:proofErr w:type="spellStart"/>
-            <w:r>
-              <w:rPr>
-                <w:rFonts w:ascii="Arial" w:hAnsi="Arial" w:cs="Arial"/>
-                <w:i/>
-                <w:lang w:val="en-US"/>
-              </w:rPr>
-              <w:t>th</w:t>
-            </w:r>
-            <w:proofErr w:type="spellEnd"/>
-            <w:r>
-              <w:rPr>
-                <w:rFonts w:ascii="Arial" w:hAnsi="Arial" w:cs="Arial"/>
-                <w:i/>
-                <w:lang w:val="en-US"/>
-              </w:rPr>
-              <w:t xml:space="preserve"> new Node in linked list</w:t>
-            </w:r>
-            <w:r>
-              <w:rPr>
-                <w:rFonts w:ascii="Arial" w:hAnsi="Arial" w:cs="Arial"/>
-                <w:i/>
-                <w:lang w:val="en-US"/>
-              </w:rPr>
-              <w:br/>
-              <w:t xml:space="preserve">        </w:t>
-            </w:r>
-            <w:proofErr w:type="spellStart"/>
-            <w:r>
-              <w:rPr>
-                <w:rFonts w:ascii="Arial" w:hAnsi="Arial" w:cs="Arial"/>
-                <w:i/>
-                <w:lang w:val="en-US"/>
-              </w:rPr>
-              <w:t>linkedList</w:t>
-            </w:r>
-            <w:proofErr w:type="spellEnd"/>
-            <w:r>
-              <w:rPr>
-                <w:rFonts w:ascii="Arial" w:hAnsi="Arial" w:cs="Arial"/>
-                <w:i/>
-                <w:lang w:val="en-US"/>
-              </w:rPr>
-              <w:t>[</w:t>
-            </w:r>
-            <w:proofErr w:type="spellStart"/>
-            <w:r>
-              <w:rPr>
-                <w:rFonts w:ascii="Arial" w:hAnsi="Arial" w:cs="Arial"/>
-                <w:i/>
-                <w:lang w:val="en-US"/>
-              </w:rPr>
-              <w:t>prevPointer</w:t>
-            </w:r>
-            <w:proofErr w:type="spellEnd"/>
-            <w:r>
-              <w:rPr>
-                <w:rFonts w:ascii="Arial" w:hAnsi="Arial" w:cs="Arial"/>
-                <w:i/>
-                <w:lang w:val="en-US"/>
-              </w:rPr>
-              <w:t>].</w:t>
-            </w:r>
-            <w:proofErr w:type="spellStart"/>
-            <w:r>
-              <w:rPr>
-                <w:rFonts w:ascii="Arial" w:hAnsi="Arial" w:cs="Arial"/>
-                <w:i/>
-                <w:lang w:val="en-US"/>
-              </w:rPr>
-              <w:t>nextNode</w:t>
-            </w:r>
-            <w:proofErr w:type="spellEnd"/>
-            <w:r>
-              <w:rPr>
-                <w:rFonts w:ascii="Arial" w:hAnsi="Arial" w:cs="Arial"/>
-                <w:i/>
-                <w:lang w:val="en-US"/>
-              </w:rPr>
-              <w:t xml:space="preserve"> = </w:t>
-            </w:r>
-            <w:proofErr w:type="spellStart"/>
-            <w:r>
-              <w:rPr>
-                <w:rFonts w:ascii="Arial" w:hAnsi="Arial" w:cs="Arial"/>
-                <w:i/>
-                <w:lang w:val="en-US"/>
-              </w:rPr>
-              <w:t>emptyList</w:t>
-            </w:r>
-            <w:proofErr w:type="spellEnd"/>
+              <w:t xml:space="preserve">        linkedList[emptyList].data = data</w:t>
+            </w:r>
+            <w:r>
+              <w:rPr>
+                <w:rFonts w:ascii="Arial" w:hAnsi="Arial" w:cs="Arial"/>
+                <w:i/>
+                <w:lang w:val="en-US"/>
+              </w:rPr>
+              <w:br/>
+              <w:t xml:space="preserve">        linkedList[emptyList].nextNode = -1</w:t>
+            </w:r>
+            <w:r>
+              <w:rPr>
+                <w:rFonts w:ascii="Arial" w:hAnsi="Arial" w:cs="Arial"/>
+                <w:i/>
+                <w:lang w:val="en-US"/>
+              </w:rPr>
+              <w:br/>
+            </w:r>
+            <w:r>
+              <w:rPr>
+                <w:rFonts w:ascii="Arial" w:hAnsi="Arial" w:cs="Arial"/>
+                <w:i/>
+                <w:lang w:val="en-US"/>
+              </w:rPr>
+              <w:br/>
+              <w:t xml:space="preserve">        # updating to join th new Node in linked list</w:t>
+            </w:r>
+            <w:r>
+              <w:rPr>
+                <w:rFonts w:ascii="Arial" w:hAnsi="Arial" w:cs="Arial"/>
+                <w:i/>
+                <w:lang w:val="en-US"/>
+              </w:rPr>
+              <w:br/>
+              <w:t xml:space="preserve">        linkedList[prevPointer].nextNode = emptyList</w:t>
+            </w:r>
             <w:r>
               <w:rPr>
                 <w:rFonts w:ascii="Arial" w:hAnsi="Arial" w:cs="Arial"/>
@@ -1945,72 +1239,8 @@
                 <w:lang w:val="en-US"/>
               </w:rPr>
               <w:br/>
-              <w:t xml:space="preserve">        </w:t>
-            </w:r>
-            <w:proofErr w:type="spellStart"/>
-            <w:r>
-              <w:rPr>
-                <w:rFonts w:ascii="Arial" w:hAnsi="Arial" w:cs="Arial"/>
-                <w:i/>
-                <w:lang w:val="en-US"/>
-              </w:rPr>
-              <w:t>emptyList</w:t>
-            </w:r>
-            <w:proofErr w:type="spellEnd"/>
-            <w:r>
-              <w:rPr>
-                <w:rFonts w:ascii="Arial" w:hAnsi="Arial" w:cs="Arial"/>
-                <w:i/>
-                <w:lang w:val="en-US"/>
-              </w:rPr>
-              <w:t xml:space="preserve"> = </w:t>
-            </w:r>
-            <w:proofErr w:type="spellStart"/>
-            <w:r>
-              <w:rPr>
-                <w:rFonts w:ascii="Arial" w:hAnsi="Arial" w:cs="Arial"/>
-                <w:i/>
-                <w:lang w:val="en-US"/>
-              </w:rPr>
-              <w:t>linkedList</w:t>
-            </w:r>
-            <w:proofErr w:type="spellEnd"/>
-            <w:r>
-              <w:rPr>
-                <w:rFonts w:ascii="Arial" w:hAnsi="Arial" w:cs="Arial"/>
-                <w:i/>
-                <w:lang w:val="en-US"/>
-              </w:rPr>
-              <w:t>[</w:t>
-            </w:r>
-            <w:proofErr w:type="spellStart"/>
-            <w:r>
-              <w:rPr>
-                <w:rFonts w:ascii="Arial" w:hAnsi="Arial" w:cs="Arial"/>
-                <w:i/>
-                <w:lang w:val="en-US"/>
-              </w:rPr>
-              <w:t>emptyList</w:t>
-            </w:r>
-            <w:proofErr w:type="spellEnd"/>
-            <w:r>
-              <w:rPr>
-                <w:rFonts w:ascii="Arial" w:hAnsi="Arial" w:cs="Arial"/>
-                <w:i/>
-                <w:lang w:val="en-US"/>
-              </w:rPr>
-              <w:t>].</w:t>
-            </w:r>
-            <w:proofErr w:type="spellStart"/>
-            <w:r>
-              <w:rPr>
-                <w:rFonts w:ascii="Arial" w:hAnsi="Arial" w:cs="Arial"/>
-                <w:i/>
-                <w:lang w:val="en-US"/>
-              </w:rPr>
-              <w:t>nextNode</w:t>
-            </w:r>
-            <w:proofErr w:type="spellEnd"/>
+              <w:t xml:space="preserve">        emptyList = linkedList[emptyList].nextNode</w:t>
+            </w:r>
             <w:r>
               <w:rPr>
                 <w:rFonts w:ascii="Arial" w:hAnsi="Arial" w:cs="Arial"/>
@@ -2061,18 +1291,8 @@
                 <w:lang w:val="en-US"/>
               </w:rPr>
               <w:br/>
-              <w:t xml:space="preserve">    # List is full as no space in </w:t>
-            </w:r>
-            <w:proofErr w:type="spellStart"/>
-            <w:r>
-              <w:rPr>
-                <w:rFonts w:ascii="Arial" w:hAnsi="Arial" w:cs="Arial"/>
-                <w:i/>
-                <w:lang w:val="en-US"/>
-              </w:rPr>
-              <w:t>emptyList</w:t>
-            </w:r>
-            <w:proofErr w:type="spellEnd"/>
+              <w:t xml:space="preserve">    # List is full as no space in emptyList</w:t>
+            </w:r>
             <w:r>
               <w:rPr>
                 <w:rFonts w:ascii="Arial" w:hAnsi="Arial" w:cs="Arial"/>
@@ -2195,7 +1415,6 @@
               <w:br/>
               <w:t xml:space="preserve">    </w:t>
             </w:r>
-            <w:proofErr w:type="spellStart"/>
             <w:proofErr w:type="gramStart"/>
             <w:r>
               <w:rPr>
@@ -2203,18 +1422,8 @@
                 <w:i/>
                 <w:lang w:val="en-US"/>
               </w:rPr>
-              <w:t>outputNodes</w:t>
-            </w:r>
-            <w:proofErr w:type="spellEnd"/>
-            <w:r>
-              <w:rPr>
-                <w:rFonts w:ascii="Arial" w:hAnsi="Arial" w:cs="Arial"/>
-                <w:i/>
-                <w:lang w:val="en-US"/>
-              </w:rPr>
-              <w:t>(</w:t>
-            </w:r>
-            <w:proofErr w:type="spellStart"/>
+              <w:t>outputNodes(</w:t>
+            </w:r>
             <w:proofErr w:type="gramEnd"/>
             <w:r>
               <w:rPr>
@@ -2222,34 +1431,7 @@
                 <w:i/>
                 <w:lang w:val="en-US"/>
               </w:rPr>
-              <w:t>linkedList</w:t>
-            </w:r>
-            <w:proofErr w:type="spellEnd"/>
-            <w:r>
-              <w:rPr>
-                <w:rFonts w:ascii="Arial" w:hAnsi="Arial" w:cs="Arial"/>
-                <w:i/>
-                <w:lang w:val="en-US"/>
-              </w:rPr>
-              <w:t xml:space="preserve">, </w:t>
-            </w:r>
-            <w:proofErr w:type="spellStart"/>
-            <w:r>
-              <w:rPr>
-                <w:rFonts w:ascii="Arial" w:hAnsi="Arial" w:cs="Arial"/>
-                <w:i/>
-                <w:lang w:val="en-US"/>
-              </w:rPr>
-              <w:t>startPointer</w:t>
-            </w:r>
-            <w:proofErr w:type="spellEnd"/>
-            <w:r>
-              <w:rPr>
-                <w:rFonts w:ascii="Arial" w:hAnsi="Arial" w:cs="Arial"/>
-                <w:i/>
-                <w:lang w:val="en-US"/>
-              </w:rPr>
-              <w:t>)</w:t>
+              <w:t>linkedList, startPointer)</w:t>
             </w:r>
             <w:r>
               <w:rPr>
@@ -2260,7 +1442,6 @@
               <w:br/>
               <w:t xml:space="preserve">    if </w:t>
             </w:r>
-            <w:proofErr w:type="spellStart"/>
             <w:proofErr w:type="gramStart"/>
             <w:r>
               <w:rPr>
@@ -2268,18 +1449,8 @@
                 <w:i/>
                 <w:lang w:val="en-US"/>
               </w:rPr>
-              <w:t>addNode</w:t>
-            </w:r>
-            <w:proofErr w:type="spellEnd"/>
-            <w:r>
-              <w:rPr>
-                <w:rFonts w:ascii="Arial" w:hAnsi="Arial" w:cs="Arial"/>
-                <w:i/>
-                <w:lang w:val="en-US"/>
-              </w:rPr>
-              <w:t>(</w:t>
-            </w:r>
-            <w:proofErr w:type="spellStart"/>
+              <w:t>addNode(</w:t>
+            </w:r>
             <w:proofErr w:type="gramEnd"/>
             <w:r>
               <w:rPr>
@@ -2287,52 +1458,7 @@
                 <w:i/>
                 <w:lang w:val="en-US"/>
               </w:rPr>
-              <w:t>linkedList</w:t>
-            </w:r>
-            <w:proofErr w:type="spellEnd"/>
-            <w:r>
-              <w:rPr>
-                <w:rFonts w:ascii="Arial" w:hAnsi="Arial" w:cs="Arial"/>
-                <w:i/>
-                <w:lang w:val="en-US"/>
-              </w:rPr>
-              <w:t xml:space="preserve">, </w:t>
-            </w:r>
-            <w:proofErr w:type="spellStart"/>
-            <w:r>
-              <w:rPr>
-                <w:rFonts w:ascii="Arial" w:hAnsi="Arial" w:cs="Arial"/>
-                <w:i/>
-                <w:lang w:val="en-US"/>
-              </w:rPr>
-              <w:t>startPointer</w:t>
-            </w:r>
-            <w:proofErr w:type="spellEnd"/>
-            <w:r>
-              <w:rPr>
-                <w:rFonts w:ascii="Arial" w:hAnsi="Arial" w:cs="Arial"/>
-                <w:i/>
-                <w:lang w:val="en-US"/>
-              </w:rPr>
-              <w:t xml:space="preserve">, </w:t>
-            </w:r>
-            <w:proofErr w:type="spellStart"/>
-            <w:r>
-              <w:rPr>
-                <w:rFonts w:ascii="Arial" w:hAnsi="Arial" w:cs="Arial"/>
-                <w:i/>
-                <w:lang w:val="en-US"/>
-              </w:rPr>
-              <w:t>emptyList</w:t>
-            </w:r>
-            <w:proofErr w:type="spellEnd"/>
-            <w:r>
-              <w:rPr>
-                <w:rFonts w:ascii="Arial" w:hAnsi="Arial" w:cs="Arial"/>
-                <w:i/>
-                <w:lang w:val="en-US"/>
-              </w:rPr>
-              <w:t>):</w:t>
+              <w:t>linkedList, startPointer, emptyList):</w:t>
             </w:r>
             <w:r>
               <w:rPr>
@@ -2414,7 +1540,6 @@
               <w:br/>
               <w:t xml:space="preserve">    </w:t>
             </w:r>
-            <w:proofErr w:type="spellStart"/>
             <w:proofErr w:type="gramStart"/>
             <w:r>
               <w:rPr>
@@ -2422,18 +1547,8 @@
                 <w:i/>
                 <w:lang w:val="en-US"/>
               </w:rPr>
-              <w:t>outputNodes</w:t>
-            </w:r>
-            <w:proofErr w:type="spellEnd"/>
-            <w:r>
-              <w:rPr>
-                <w:rFonts w:ascii="Arial" w:hAnsi="Arial" w:cs="Arial"/>
-                <w:i/>
-                <w:lang w:val="en-US"/>
-              </w:rPr>
-              <w:t>(</w:t>
-            </w:r>
-            <w:proofErr w:type="spellStart"/>
+              <w:t>outputNodes(</w:t>
+            </w:r>
             <w:proofErr w:type="gramEnd"/>
             <w:r>
               <w:rPr>
@@ -2441,34 +1556,7 @@
                 <w:i/>
                 <w:lang w:val="en-US"/>
               </w:rPr>
-              <w:t>linkedList</w:t>
-            </w:r>
-            <w:proofErr w:type="spellEnd"/>
-            <w:r>
-              <w:rPr>
-                <w:rFonts w:ascii="Arial" w:hAnsi="Arial" w:cs="Arial"/>
-                <w:i/>
-                <w:lang w:val="en-US"/>
-              </w:rPr>
-              <w:t xml:space="preserve">, </w:t>
-            </w:r>
-            <w:proofErr w:type="spellStart"/>
-            <w:r>
-              <w:rPr>
-                <w:rFonts w:ascii="Arial" w:hAnsi="Arial" w:cs="Arial"/>
-                <w:i/>
-                <w:lang w:val="en-US"/>
-              </w:rPr>
-              <w:t>startPointer</w:t>
-            </w:r>
-            <w:proofErr w:type="spellEnd"/>
-            <w:r>
-              <w:rPr>
-                <w:rFonts w:ascii="Arial" w:hAnsi="Arial" w:cs="Arial"/>
-                <w:i/>
-                <w:lang w:val="en-US"/>
-              </w:rPr>
-              <w:t>)</w:t>
+              <w:t>linkedList, startPointer)</w:t>
             </w:r>
           </w:p>
           <w:p>
@@ -2572,7 +1660,7 @@
                 <w:noProof/>
               </w:rPr>
               <w:pict w14:anchorId="7F55D6D1">
-                <v:shape id="_x0000_i1028" type="#_x0000_t75" style="width:361.5pt;height:348.75pt;visibility:visible;mso-wrap-style:square">
+                <v:shape id="_x0000_i1026" type="#_x0000_t75" style="width:361.5pt;height:348.75pt;visibility:visible;mso-wrap-style:square">
                   <v:imagedata r:id="rId7" o:title=""/>
                 </v:shape>
               </w:pict>
@@ -2680,23 +1768,13 @@
                 <w:lang w:val="en-US"/>
               </w:rPr>
             </w:pPr>
-            <w:proofErr w:type="spellStart"/>
-            <w:r>
-              <w:rPr>
-                <w:rFonts w:ascii="Arial" w:hAnsi="Arial" w:cs="Arial"/>
-                <w:i/>
-                <w:lang w:val="en-US"/>
-              </w:rPr>
-              <w:t>arrayData</w:t>
-            </w:r>
-            <w:proofErr w:type="spellEnd"/>
-            <w:r>
-              <w:rPr>
-                <w:rFonts w:ascii="Arial" w:hAnsi="Arial" w:cs="Arial"/>
-                <w:i/>
-                <w:lang w:val="en-US"/>
-              </w:rPr>
-              <w:t xml:space="preserve"> = [10, 5, 6, 7, 1, </w:t>
+            <w:r>
+              <w:rPr>
+                <w:rFonts w:ascii="Arial" w:hAnsi="Arial" w:cs="Arial"/>
+                <w:i/>
+                <w:lang w:val="en-US"/>
+              </w:rPr>
+              <w:t xml:space="preserve">arrayData = [10, 5, 6, 7, 1, </w:t>
             </w:r>
             <w:proofErr w:type="gramStart"/>
             <w:r>
@@ -2785,27 +1863,7 @@
                 <w:sz w:val="28"/>
                 <w:szCs w:val="28"/>
               </w:rPr>
-              <w:t>(</w:t>
-            </w:r>
-            <w:proofErr w:type="spellStart"/>
-            <w:r>
-              <w:rPr>
-                <w:rFonts w:ascii="Arial" w:hAnsi="Arial" w:cs="Arial"/>
-                <w:b/>
-                <w:sz w:val="28"/>
-                <w:szCs w:val="28"/>
-              </w:rPr>
-              <w:t>i</w:t>
-            </w:r>
-            <w:proofErr w:type="spellEnd"/>
-            <w:r>
-              <w:rPr>
-                <w:rFonts w:ascii="Arial" w:hAnsi="Arial" w:cs="Arial"/>
-                <w:b/>
-                <w:sz w:val="28"/>
-                <w:szCs w:val="28"/>
-              </w:rPr>
-              <w:t>)</w:t>
+              <w:t>(i)</w:t>
             </w:r>
           </w:p>
         </w:tc>
@@ -2830,45 +1888,17 @@
                 <w:i/>
                 <w:lang w:val="en-US"/>
               </w:rPr>
-              <w:t xml:space="preserve">def </w:t>
-            </w:r>
-            <w:proofErr w:type="spellStart"/>
-            <w:r>
-              <w:rPr>
-                <w:rFonts w:ascii="Arial" w:hAnsi="Arial" w:cs="Arial"/>
-                <w:i/>
-                <w:lang w:val="en-US"/>
-              </w:rPr>
-              <w:t>linearSearch</w:t>
-            </w:r>
-            <w:proofErr w:type="spellEnd"/>
-            <w:r>
-              <w:rPr>
-                <w:rFonts w:ascii="Arial" w:hAnsi="Arial" w:cs="Arial"/>
-                <w:i/>
-                <w:lang w:val="en-US"/>
-              </w:rPr>
-              <w:t>(search):</w:t>
-            </w:r>
-            <w:r>
-              <w:rPr>
-                <w:rFonts w:ascii="Arial" w:hAnsi="Arial" w:cs="Arial"/>
-                <w:i/>
-                <w:lang w:val="en-US"/>
-              </w:rPr>
-              <w:br/>
-              <w:t xml:space="preserve">    global </w:t>
-            </w:r>
-            <w:proofErr w:type="spellStart"/>
-            <w:r>
-              <w:rPr>
-                <w:rFonts w:ascii="Arial" w:hAnsi="Arial" w:cs="Arial"/>
-                <w:i/>
-                <w:lang w:val="en-US"/>
-              </w:rPr>
-              <w:t>arrayData</w:t>
-            </w:r>
-            <w:proofErr w:type="spellEnd"/>
+              <w:t>def linearSearch(search):</w:t>
+            </w:r>
+            <w:r>
+              <w:rPr>
+                <w:rFonts w:ascii="Arial" w:hAnsi="Arial" w:cs="Arial"/>
+                <w:i/>
+                <w:lang w:val="en-US"/>
+              </w:rPr>
+              <w:br/>
+              <w:t xml:space="preserve">    global arrayData</w:t>
+            </w:r>
             <w:r>
               <w:rPr>
                 <w:rFonts w:ascii="Arial" w:hAnsi="Arial" w:cs="Arial"/>
@@ -2885,123 +1915,33 @@
                 <w:lang w:val="en-US"/>
               </w:rPr>
               <w:br/>
-              <w:t xml:space="preserve">    size = </w:t>
-            </w:r>
-            <w:proofErr w:type="spellStart"/>
-            <w:r>
-              <w:rPr>
-                <w:rFonts w:ascii="Arial" w:hAnsi="Arial" w:cs="Arial"/>
-                <w:i/>
-                <w:lang w:val="en-US"/>
-              </w:rPr>
-              <w:t>len</w:t>
-            </w:r>
-            <w:proofErr w:type="spellEnd"/>
-            <w:r>
-              <w:rPr>
-                <w:rFonts w:ascii="Arial" w:hAnsi="Arial" w:cs="Arial"/>
-                <w:i/>
-                <w:lang w:val="en-US"/>
-              </w:rPr>
-              <w:t>(</w:t>
-            </w:r>
-            <w:proofErr w:type="spellStart"/>
-            <w:r>
-              <w:rPr>
-                <w:rFonts w:ascii="Arial" w:hAnsi="Arial" w:cs="Arial"/>
-                <w:i/>
-                <w:lang w:val="en-US"/>
-              </w:rPr>
-              <w:t>arrayData</w:t>
-            </w:r>
-            <w:proofErr w:type="spellEnd"/>
-            <w:r>
-              <w:rPr>
-                <w:rFonts w:ascii="Arial" w:hAnsi="Arial" w:cs="Arial"/>
-                <w:i/>
-                <w:lang w:val="en-US"/>
-              </w:rPr>
-              <w:t>) - 1</w:t>
-            </w:r>
-            <w:r>
-              <w:rPr>
-                <w:rFonts w:ascii="Arial" w:hAnsi="Arial" w:cs="Arial"/>
-                <w:i/>
-                <w:lang w:val="en-US"/>
-              </w:rPr>
-              <w:br/>
-            </w:r>
-            <w:r>
-              <w:rPr>
-                <w:rFonts w:ascii="Arial" w:hAnsi="Arial" w:cs="Arial"/>
-                <w:i/>
-                <w:lang w:val="en-US"/>
-              </w:rPr>
-              <w:br/>
-              <w:t xml:space="preserve">    for </w:t>
-            </w:r>
-            <w:proofErr w:type="spellStart"/>
-            <w:r>
-              <w:rPr>
-                <w:rFonts w:ascii="Arial" w:hAnsi="Arial" w:cs="Arial"/>
-                <w:i/>
-                <w:lang w:val="en-US"/>
-              </w:rPr>
-              <w:t>i</w:t>
-            </w:r>
-            <w:proofErr w:type="spellEnd"/>
-            <w:r>
-              <w:rPr>
-                <w:rFonts w:ascii="Arial" w:hAnsi="Arial" w:cs="Arial"/>
-                <w:i/>
-                <w:lang w:val="en-US"/>
-              </w:rPr>
-              <w:t xml:space="preserve"> in range(size):</w:t>
-            </w:r>
-            <w:r>
-              <w:rPr>
-                <w:rFonts w:ascii="Arial" w:hAnsi="Arial" w:cs="Arial"/>
-                <w:i/>
-                <w:lang w:val="en-US"/>
-              </w:rPr>
-              <w:br/>
-              <w:t xml:space="preserve">        if </w:t>
-            </w:r>
-            <w:proofErr w:type="spellStart"/>
-            <w:r>
-              <w:rPr>
-                <w:rFonts w:ascii="Arial" w:hAnsi="Arial" w:cs="Arial"/>
-                <w:i/>
-                <w:lang w:val="en-US"/>
-              </w:rPr>
-              <w:t>arrayData</w:t>
-            </w:r>
-            <w:proofErr w:type="spellEnd"/>
-            <w:r>
-              <w:rPr>
-                <w:rFonts w:ascii="Arial" w:hAnsi="Arial" w:cs="Arial"/>
-                <w:i/>
-                <w:lang w:val="en-US"/>
-              </w:rPr>
-              <w:t>[</w:t>
-            </w:r>
-            <w:proofErr w:type="spellStart"/>
-            <w:r>
-              <w:rPr>
-                <w:rFonts w:ascii="Arial" w:hAnsi="Arial" w:cs="Arial"/>
-                <w:i/>
-                <w:lang w:val="en-US"/>
-              </w:rPr>
-              <w:t>i</w:t>
-            </w:r>
-            <w:proofErr w:type="spellEnd"/>
-            <w:r>
-              <w:rPr>
-                <w:rFonts w:ascii="Arial" w:hAnsi="Arial" w:cs="Arial"/>
-                <w:i/>
-                <w:lang w:val="en-US"/>
-              </w:rPr>
-              <w:t>] == search:</w:t>
+              <w:t xml:space="preserve">    size = len(arrayData) - 1</w:t>
+            </w:r>
+            <w:r>
+              <w:rPr>
+                <w:rFonts w:ascii="Arial" w:hAnsi="Arial" w:cs="Arial"/>
+                <w:i/>
+                <w:lang w:val="en-US"/>
+              </w:rPr>
+              <w:br/>
+            </w:r>
+            <w:r>
+              <w:rPr>
+                <w:rFonts w:ascii="Arial" w:hAnsi="Arial" w:cs="Arial"/>
+                <w:i/>
+                <w:lang w:val="en-US"/>
+              </w:rPr>
+              <w:br/>
+              <w:t xml:space="preserve">    for i in range(size):</w:t>
+            </w:r>
+            <w:r>
+              <w:rPr>
+                <w:rFonts w:ascii="Arial" w:hAnsi="Arial" w:cs="Arial"/>
+                <w:i/>
+                <w:lang w:val="en-US"/>
+              </w:rPr>
+              <w:br/>
+              <w:t xml:space="preserve">        if arrayData[i] == search:</w:t>
             </w:r>
             <w:r>
               <w:rPr>
@@ -3203,25 +2143,7 @@
                 <w:lang w:val="en-US"/>
               </w:rPr>
               <w:br/>
-              <w:t xml:space="preserve">    if </w:t>
-            </w:r>
-            <w:proofErr w:type="spellStart"/>
-            <w:r>
-              <w:rPr>
-                <w:rFonts w:ascii="Arial" w:hAnsi="Arial" w:cs="Arial"/>
-                <w:i/>
-                <w:lang w:val="en-US"/>
-              </w:rPr>
-              <w:t>linearSearch</w:t>
-            </w:r>
-            <w:proofErr w:type="spellEnd"/>
-            <w:r>
-              <w:rPr>
-                <w:rFonts w:ascii="Arial" w:hAnsi="Arial" w:cs="Arial"/>
-                <w:i/>
-                <w:lang w:val="en-US"/>
-              </w:rPr>
-              <w:t>(search):</w:t>
+              <w:t xml:space="preserve">    if linearSearch(search):</w:t>
             </w:r>
             <w:r>
               <w:rPr>
@@ -3344,7 +2266,7 @@
                 <w:noProof/>
               </w:rPr>
               <w:pict w14:anchorId="72B766B8">
-                <v:shape id="_x0000_i1029" type="#_x0000_t75" style="width:368.25pt;height:84.75pt;visibility:visible;mso-wrap-style:square">
+                <v:shape id="_x0000_i1027" type="#_x0000_t75" style="width:368.25pt;height:84.75pt;visibility:visible;mso-wrap-style:square">
                   <v:imagedata r:id="rId8" o:title=""/>
                 </v:shape>
               </w:pict>
@@ -3375,7 +2297,7 @@
                 <w:noProof/>
               </w:rPr>
               <w:pict w14:anchorId="2ED28C74">
-                <v:shape id="_x0000_i1030" type="#_x0000_t75" style="width:367.5pt;height:78.75pt;visibility:visible;mso-wrap-style:square">
+                <v:shape id="_x0000_i1028" type="#_x0000_t75" style="width:367.5pt;height:78.75pt;visibility:visible;mso-wrap-style:square">
                   <v:imagedata r:id="rId9" o:title=""/>
                 </v:shape>
               </w:pict>
@@ -3474,7 +2396,6 @@
               </w:rPr>
               <w:t xml:space="preserve">def </w:t>
             </w:r>
-            <w:proofErr w:type="spellStart"/>
             <w:proofErr w:type="gramStart"/>
             <w:r>
               <w:rPr>
@@ -3482,16 +2403,7 @@
                 <w:i/>
                 <w:lang w:val="en-US"/>
               </w:rPr>
-              <w:t>bubbleSort</w:t>
-            </w:r>
-            <w:proofErr w:type="spellEnd"/>
-            <w:r>
-              <w:rPr>
-                <w:rFonts w:ascii="Arial" w:hAnsi="Arial" w:cs="Arial"/>
-                <w:i/>
-                <w:lang w:val="en-US"/>
-              </w:rPr>
-              <w:t>(</w:t>
+              <w:t>bubbleSort(</w:t>
             </w:r>
             <w:proofErr w:type="gramEnd"/>
             <w:r>
@@ -3509,62 +2421,16 @@
                 <w:lang w:val="en-US"/>
               </w:rPr>
               <w:br/>
-              <w:t xml:space="preserve">    global </w:t>
-            </w:r>
-            <w:proofErr w:type="spellStart"/>
-            <w:r>
-              <w:rPr>
-                <w:rFonts w:ascii="Arial" w:hAnsi="Arial" w:cs="Arial"/>
-                <w:i/>
-                <w:lang w:val="en-US"/>
-              </w:rPr>
-              <w:t>arrayData</w:t>
-            </w:r>
-            <w:proofErr w:type="spellEnd"/>
-            <w:r>
-              <w:rPr>
-                <w:rFonts w:ascii="Arial" w:hAnsi="Arial" w:cs="Arial"/>
-                <w:i/>
-                <w:lang w:val="en-US"/>
-              </w:rPr>
-              <w:br/>
-              <w:t xml:space="preserve">    size = </w:t>
-            </w:r>
-            <w:proofErr w:type="spellStart"/>
-            <w:r>
-              <w:rPr>
-                <w:rFonts w:ascii="Arial" w:hAnsi="Arial" w:cs="Arial"/>
-                <w:i/>
-                <w:lang w:val="en-US"/>
-              </w:rPr>
-              <w:t>len</w:t>
-            </w:r>
-            <w:proofErr w:type="spellEnd"/>
-            <w:r>
-              <w:rPr>
-                <w:rFonts w:ascii="Arial" w:hAnsi="Arial" w:cs="Arial"/>
-                <w:i/>
-                <w:lang w:val="en-US"/>
-              </w:rPr>
-              <w:t>(</w:t>
-            </w:r>
-            <w:proofErr w:type="spellStart"/>
-            <w:r>
-              <w:rPr>
-                <w:rFonts w:ascii="Arial" w:hAnsi="Arial" w:cs="Arial"/>
-                <w:i/>
-                <w:lang w:val="en-US"/>
-              </w:rPr>
-              <w:t>arrayData</w:t>
-            </w:r>
-            <w:proofErr w:type="spellEnd"/>
-            <w:r>
-              <w:rPr>
-                <w:rFonts w:ascii="Arial" w:hAnsi="Arial" w:cs="Arial"/>
-                <w:i/>
-                <w:lang w:val="en-US"/>
-              </w:rPr>
-              <w:t>)</w:t>
+              <w:t xml:space="preserve">    global arrayData</w:t>
+            </w:r>
+            <w:r>
+              <w:rPr>
+                <w:rFonts w:ascii="Arial" w:hAnsi="Arial" w:cs="Arial"/>
+                <w:i/>
+                <w:lang w:val="en-US"/>
+              </w:rPr>
+              <w:br/>
+              <w:t xml:space="preserve">    size = len(arrayData)</w:t>
             </w:r>
             <w:r>
               <w:rPr>
@@ -3609,27 +2475,8 @@
                 <w:lang w:val="en-US"/>
               </w:rPr>
               <w:br/>
-              <w:t xml:space="preserve">            if </w:t>
-            </w:r>
-            <w:proofErr w:type="spellStart"/>
-            <w:r>
-              <w:rPr>
-                <w:rFonts w:ascii="Arial" w:hAnsi="Arial" w:cs="Arial"/>
-                <w:i/>
-                <w:lang w:val="en-US"/>
-              </w:rPr>
-              <w:t>arrayData</w:t>
-            </w:r>
-            <w:proofErr w:type="spellEnd"/>
-            <w:r>
-              <w:rPr>
-                <w:rFonts w:ascii="Arial" w:hAnsi="Arial" w:cs="Arial"/>
-                <w:i/>
-                <w:lang w:val="en-US"/>
-              </w:rPr>
-              <w:t xml:space="preserve">[y] &gt; </w:t>
-            </w:r>
-            <w:proofErr w:type="spellStart"/>
+              <w:t xml:space="preserve">            if arrayData[y] &gt; </w:t>
+            </w:r>
             <w:proofErr w:type="gramStart"/>
             <w:r>
               <w:rPr>
@@ -3637,16 +2484,7 @@
                 <w:i/>
                 <w:lang w:val="en-US"/>
               </w:rPr>
-              <w:t>arrayData</w:t>
-            </w:r>
-            <w:proofErr w:type="spellEnd"/>
-            <w:r>
-              <w:rPr>
-                <w:rFonts w:ascii="Arial" w:hAnsi="Arial" w:cs="Arial"/>
-                <w:i/>
-                <w:lang w:val="en-US"/>
-              </w:rPr>
-              <w:t>[</w:t>
+              <w:t>arrayData[</w:t>
             </w:r>
             <w:proofErr w:type="gramEnd"/>
             <w:r>
@@ -3673,25 +2511,34 @@
                 <w:lang w:val="en-US"/>
               </w:rPr>
               <w:br/>
-              <w:t xml:space="preserve">                temp = </w:t>
-            </w:r>
-            <w:proofErr w:type="spellStart"/>
-            <w:r>
-              <w:rPr>
-                <w:rFonts w:ascii="Arial" w:hAnsi="Arial" w:cs="Arial"/>
-                <w:i/>
-                <w:lang w:val="en-US"/>
-              </w:rPr>
-              <w:t>arrayData</w:t>
-            </w:r>
-            <w:proofErr w:type="spellEnd"/>
-            <w:r>
-              <w:rPr>
-                <w:rFonts w:ascii="Arial" w:hAnsi="Arial" w:cs="Arial"/>
-                <w:i/>
-                <w:lang w:val="en-US"/>
-              </w:rPr>
-              <w:t>[y]</w:t>
+              <w:t xml:space="preserve">                temp = arrayData[y]</w:t>
+            </w:r>
+            <w:r>
+              <w:rPr>
+                <w:rFonts w:ascii="Arial" w:hAnsi="Arial" w:cs="Arial"/>
+                <w:i/>
+                <w:lang w:val="en-US"/>
+              </w:rPr>
+              <w:br/>
+              <w:t xml:space="preserve">                arrayData[y] = </w:t>
+            </w:r>
+            <w:proofErr w:type="gramStart"/>
+            <w:r>
+              <w:rPr>
+                <w:rFonts w:ascii="Arial" w:hAnsi="Arial" w:cs="Arial"/>
+                <w:i/>
+                <w:lang w:val="en-US"/>
+              </w:rPr>
+              <w:t>arrayData[</w:t>
+            </w:r>
+            <w:proofErr w:type="gramEnd"/>
+            <w:r>
+              <w:rPr>
+                <w:rFonts w:ascii="Arial" w:hAnsi="Arial" w:cs="Arial"/>
+                <w:i/>
+                <w:lang w:val="en-US"/>
+              </w:rPr>
+              <w:t>y + 1]</w:t>
             </w:r>
             <w:r>
               <w:rPr>
@@ -3702,25 +2549,6 @@
               <w:br/>
               <w:t xml:space="preserve">                </w:t>
             </w:r>
-            <w:proofErr w:type="spellStart"/>
-            <w:r>
-              <w:rPr>
-                <w:rFonts w:ascii="Arial" w:hAnsi="Arial" w:cs="Arial"/>
-                <w:i/>
-                <w:lang w:val="en-US"/>
-              </w:rPr>
-              <w:t>arrayData</w:t>
-            </w:r>
-            <w:proofErr w:type="spellEnd"/>
-            <w:r>
-              <w:rPr>
-                <w:rFonts w:ascii="Arial" w:hAnsi="Arial" w:cs="Arial"/>
-                <w:i/>
-                <w:lang w:val="en-US"/>
-              </w:rPr>
-              <w:t xml:space="preserve">[y] = </w:t>
-            </w:r>
-            <w:proofErr w:type="spellStart"/>
             <w:proofErr w:type="gramStart"/>
             <w:r>
               <w:rPr>
@@ -3728,53 +2556,7 @@
                 <w:i/>
                 <w:lang w:val="en-US"/>
               </w:rPr>
-              <w:t>arrayData</w:t>
-            </w:r>
-            <w:proofErr w:type="spellEnd"/>
-            <w:r>
-              <w:rPr>
-                <w:rFonts w:ascii="Arial" w:hAnsi="Arial" w:cs="Arial"/>
-                <w:i/>
-                <w:lang w:val="en-US"/>
-              </w:rPr>
-              <w:t>[</w:t>
-            </w:r>
-            <w:proofErr w:type="gramEnd"/>
-            <w:r>
-              <w:rPr>
-                <w:rFonts w:ascii="Arial" w:hAnsi="Arial" w:cs="Arial"/>
-                <w:i/>
-                <w:lang w:val="en-US"/>
-              </w:rPr>
-              <w:t>y + 1]</w:t>
-            </w:r>
-            <w:r>
-              <w:rPr>
-                <w:rFonts w:ascii="Arial" w:hAnsi="Arial" w:cs="Arial"/>
-                <w:i/>
-                <w:lang w:val="en-US"/>
-              </w:rPr>
-              <w:br/>
-              <w:t xml:space="preserve">                </w:t>
-            </w:r>
-            <w:proofErr w:type="spellStart"/>
-            <w:proofErr w:type="gramStart"/>
-            <w:r>
-              <w:rPr>
-                <w:rFonts w:ascii="Arial" w:hAnsi="Arial" w:cs="Arial"/>
-                <w:i/>
-                <w:lang w:val="en-US"/>
-              </w:rPr>
-              <w:t>arrayData</w:t>
-            </w:r>
-            <w:proofErr w:type="spellEnd"/>
-            <w:r>
-              <w:rPr>
-                <w:rFonts w:ascii="Arial" w:hAnsi="Arial" w:cs="Arial"/>
-                <w:i/>
-                <w:lang w:val="en-US"/>
-              </w:rPr>
-              <w:t>[</w:t>
+              <w:t>arrayData[</w:t>
             </w:r>
             <w:proofErr w:type="gramEnd"/>
             <w:r>
@@ -3916,52 +2698,16 @@
                 <w:i/>
                 <w:lang w:val="en-US"/>
               </w:rPr>
-              <w:t xml:space="preserve">class </w:t>
-            </w:r>
-            <w:proofErr w:type="spellStart"/>
-            <w:r>
-              <w:rPr>
-                <w:rFonts w:ascii="Arial" w:hAnsi="Arial" w:cs="Arial"/>
-                <w:i/>
-                <w:lang w:val="en-US"/>
-              </w:rPr>
-              <w:t>TreasureChest</w:t>
-            </w:r>
-            <w:proofErr w:type="spellEnd"/>
-            <w:r>
-              <w:rPr>
-                <w:rFonts w:ascii="Arial" w:hAnsi="Arial" w:cs="Arial"/>
-                <w:i/>
-                <w:lang w:val="en-US"/>
-              </w:rPr>
-              <w:t>:</w:t>
-            </w:r>
-            <w:r>
-              <w:rPr>
-                <w:rFonts w:ascii="Arial" w:hAnsi="Arial" w:cs="Arial"/>
-                <w:i/>
-                <w:lang w:val="en-US"/>
-              </w:rPr>
-              <w:br/>
-              <w:t xml:space="preserve">    def __</w:t>
-            </w:r>
-            <w:proofErr w:type="spellStart"/>
-            <w:r>
-              <w:rPr>
-                <w:rFonts w:ascii="Arial" w:hAnsi="Arial" w:cs="Arial"/>
-                <w:i/>
-                <w:lang w:val="en-US"/>
-              </w:rPr>
-              <w:t>init</w:t>
-            </w:r>
-            <w:proofErr w:type="spellEnd"/>
-            <w:r>
-              <w:rPr>
-                <w:rFonts w:ascii="Arial" w:hAnsi="Arial" w:cs="Arial"/>
-                <w:i/>
-                <w:lang w:val="en-US"/>
-              </w:rPr>
-              <w:t>_</w:t>
+              <w:t>class TreasureChest:</w:t>
+            </w:r>
+            <w:r>
+              <w:rPr>
+                <w:rFonts w:ascii="Arial" w:hAnsi="Arial" w:cs="Arial"/>
+                <w:i/>
+                <w:lang w:val="en-US"/>
+              </w:rPr>
+              <w:br/>
+              <w:t xml:space="preserve">    def __init_</w:t>
             </w:r>
             <w:proofErr w:type="gramStart"/>
             <w:r>
@@ -3979,25 +2725,7 @@
                 <w:i/>
                 <w:lang w:val="en-US"/>
               </w:rPr>
-              <w:t xml:space="preserve">self, q, </w:t>
-            </w:r>
-            <w:proofErr w:type="spellStart"/>
-            <w:r>
-              <w:rPr>
-                <w:rFonts w:ascii="Arial" w:hAnsi="Arial" w:cs="Arial"/>
-                <w:i/>
-                <w:lang w:val="en-US"/>
-              </w:rPr>
-              <w:t>ans</w:t>
-            </w:r>
-            <w:proofErr w:type="spellEnd"/>
-            <w:r>
-              <w:rPr>
-                <w:rFonts w:ascii="Arial" w:hAnsi="Arial" w:cs="Arial"/>
-                <w:i/>
-                <w:lang w:val="en-US"/>
-              </w:rPr>
-              <w:t>, points):</w:t>
+              <w:t>self, q, ans, points):</w:t>
             </w:r>
             <w:r>
               <w:rPr>
@@ -4008,7 +2736,6 @@
               <w:br/>
               <w:t xml:space="preserve">        </w:t>
             </w:r>
-            <w:proofErr w:type="spellStart"/>
             <w:proofErr w:type="gramStart"/>
             <w:r>
               <w:rPr>
@@ -4025,16 +2752,7 @@
                 <w:i/>
                 <w:lang w:val="en-US"/>
               </w:rPr>
-              <w:t>_question</w:t>
-            </w:r>
-            <w:proofErr w:type="spellEnd"/>
-            <w:r>
-              <w:rPr>
-                <w:rFonts w:ascii="Arial" w:hAnsi="Arial" w:cs="Arial"/>
-                <w:i/>
-                <w:lang w:val="en-US"/>
-              </w:rPr>
-              <w:t xml:space="preserve"> = </w:t>
+              <w:t xml:space="preserve">_question = </w:t>
             </w:r>
             <w:proofErr w:type="gramStart"/>
             <w:r>
@@ -4063,7 +2781,6 @@
               <w:br/>
               <w:t xml:space="preserve">        </w:t>
             </w:r>
-            <w:proofErr w:type="spellStart"/>
             <w:proofErr w:type="gramStart"/>
             <w:r>
               <w:rPr>
@@ -4080,18 +2797,8 @@
                 <w:i/>
                 <w:lang w:val="en-US"/>
               </w:rPr>
-              <w:t>_answer</w:t>
-            </w:r>
-            <w:proofErr w:type="spellEnd"/>
-            <w:r>
-              <w:rPr>
-                <w:rFonts w:ascii="Arial" w:hAnsi="Arial" w:cs="Arial"/>
-                <w:i/>
-                <w:lang w:val="en-US"/>
-              </w:rPr>
-              <w:t xml:space="preserve"> = </w:t>
-            </w:r>
-            <w:proofErr w:type="spellStart"/>
+              <w:t xml:space="preserve">_answer = </w:t>
+            </w:r>
             <w:proofErr w:type="gramStart"/>
             <w:r>
               <w:rPr>
@@ -4099,16 +2806,7 @@
                 <w:i/>
                 <w:lang w:val="en-US"/>
               </w:rPr>
-              <w:t>ans</w:t>
-            </w:r>
-            <w:proofErr w:type="spellEnd"/>
-            <w:r>
-              <w:rPr>
-                <w:rFonts w:ascii="Arial" w:hAnsi="Arial" w:cs="Arial"/>
-                <w:i/>
-                <w:lang w:val="en-US"/>
-              </w:rPr>
-              <w:t xml:space="preserve">  #</w:t>
+              <w:t>ans  #</w:t>
             </w:r>
             <w:proofErr w:type="gramEnd"/>
             <w:r>
@@ -4136,7 +2834,6 @@
               <w:lastRenderedPageBreak/>
               <w:t xml:space="preserve">        </w:t>
             </w:r>
-            <w:proofErr w:type="spellStart"/>
             <w:proofErr w:type="gramStart"/>
             <w:r>
               <w:rPr>
@@ -4153,16 +2850,7 @@
                 <w:i/>
                 <w:lang w:val="en-US"/>
               </w:rPr>
-              <w:t>_points</w:t>
-            </w:r>
-            <w:proofErr w:type="spellEnd"/>
-            <w:r>
-              <w:rPr>
-                <w:rFonts w:ascii="Arial" w:hAnsi="Arial" w:cs="Arial"/>
-                <w:i/>
-                <w:lang w:val="en-US"/>
-              </w:rPr>
-              <w:t xml:space="preserve"> = </w:t>
+              <w:t xml:space="preserve">_points = </w:t>
             </w:r>
             <w:proofErr w:type="gramStart"/>
             <w:r>
@@ -4298,74 +2986,713 @@
               <w:rPr>
                 <w:rFonts w:ascii="Arial" w:hAnsi="Arial" w:cs="Arial"/>
                 <w:i/>
-              </w:rPr>
-            </w:pPr>
-            <w:r>
-              <w:rPr>
-                <w:rFonts w:ascii="Arial" w:hAnsi="Arial" w:cs="Arial"/>
-                <w:i/>
-              </w:rPr>
-              <w:t xml:space="preserve">{Copy and paste program code listing for question </w:t>
-            </w:r>
-            <w:r>
-              <w:rPr>
-                <w:rFonts w:ascii="Arial" w:hAnsi="Arial" w:cs="Arial"/>
-                <w:i/>
-              </w:rPr>
-              <w:t>3(b)</w:t>
-            </w:r>
-            <w:r>
-              <w:rPr>
-                <w:rFonts w:ascii="Arial" w:hAnsi="Arial" w:cs="Arial"/>
-                <w:i/>
-              </w:rPr>
-              <w:t xml:space="preserve"> here}</w:t>
-            </w:r>
-          </w:p>
-          <w:p>
-            <w:pPr>
-              <w:spacing w:after="0" w:line="240" w:lineRule="auto"/>
-              <w:rPr>
-                <w:rFonts w:ascii="Arial" w:hAnsi="Arial" w:cs="Arial"/>
-                <w:i/>
-              </w:rPr>
-            </w:pPr>
-          </w:p>
-          <w:p>
-            <w:pPr>
-              <w:spacing w:after="0" w:line="240" w:lineRule="auto"/>
-              <w:rPr>
-                <w:rFonts w:ascii="Arial" w:hAnsi="Arial" w:cs="Arial"/>
-                <w:i/>
-              </w:rPr>
-            </w:pPr>
-          </w:p>
-          <w:p>
-            <w:pPr>
-              <w:spacing w:after="0" w:line="240" w:lineRule="auto"/>
-              <w:rPr>
-                <w:rFonts w:ascii="Arial" w:hAnsi="Arial" w:cs="Arial"/>
-                <w:i/>
-              </w:rPr>
-            </w:pPr>
-          </w:p>
-          <w:p>
-            <w:pPr>
-              <w:spacing w:after="0" w:line="240" w:lineRule="auto"/>
-              <w:rPr>
-                <w:rFonts w:ascii="Arial" w:hAnsi="Arial" w:cs="Arial"/>
-                <w:i/>
-              </w:rPr>
-            </w:pPr>
-          </w:p>
-          <w:p>
-            <w:pPr>
-              <w:spacing w:after="0" w:line="240" w:lineRule="auto"/>
-              <w:rPr>
-                <w:rFonts w:ascii="Arial" w:hAnsi="Arial" w:cs="Arial"/>
-                <w:i/>
-              </w:rPr>
-            </w:pPr>
+                <w:lang w:val="en-PK"/>
+              </w:rPr>
+            </w:pPr>
+            <w:r>
+              <w:rPr>
+                <w:rFonts w:ascii="Arial" w:hAnsi="Arial" w:cs="Arial"/>
+                <w:i/>
+                <w:lang w:val="en-PK"/>
+              </w:rPr>
+              <w:t>arrayTreasure = [] * 4</w:t>
+            </w:r>
+          </w:p>
+          <w:p>
+            <w:pPr>
+              <w:spacing w:after="0" w:line="240" w:lineRule="auto"/>
+              <w:rPr>
+                <w:rFonts w:ascii="Arial" w:hAnsi="Arial" w:cs="Arial"/>
+                <w:i/>
+                <w:lang w:val="en-PK"/>
+              </w:rPr>
+            </w:pPr>
+          </w:p>
+          <w:p>
+            <w:pPr>
+              <w:spacing w:after="0" w:line="240" w:lineRule="auto"/>
+              <w:rPr>
+                <w:rFonts w:ascii="Arial" w:hAnsi="Arial" w:cs="Arial"/>
+                <w:i/>
+                <w:lang w:val="en-PK"/>
+              </w:rPr>
+            </w:pPr>
+            <w:r>
+              <w:rPr>
+                <w:rFonts w:ascii="Arial" w:hAnsi="Arial" w:cs="Arial"/>
+                <w:i/>
+                <w:lang w:val="en-PK"/>
+              </w:rPr>
+              <w:t xml:space="preserve">def </w:t>
+            </w:r>
+            <w:proofErr w:type="gramStart"/>
+            <w:r>
+              <w:rPr>
+                <w:rFonts w:ascii="Arial" w:hAnsi="Arial" w:cs="Arial"/>
+                <w:i/>
+                <w:lang w:val="en-PK"/>
+              </w:rPr>
+              <w:t>readData(</w:t>
+            </w:r>
+            <w:proofErr w:type="gramEnd"/>
+            <w:r>
+              <w:rPr>
+                <w:rFonts w:ascii="Arial" w:hAnsi="Arial" w:cs="Arial"/>
+                <w:i/>
+                <w:lang w:val="en-PK"/>
+              </w:rPr>
+              <w:t>):</w:t>
+            </w:r>
+          </w:p>
+          <w:p>
+            <w:pPr>
+              <w:spacing w:after="0" w:line="240" w:lineRule="auto"/>
+              <w:rPr>
+                <w:rFonts w:ascii="Arial" w:hAnsi="Arial" w:cs="Arial"/>
+                <w:i/>
+                <w:lang w:val="en-PK"/>
+              </w:rPr>
+            </w:pPr>
+            <w:r>
+              <w:rPr>
+                <w:rFonts w:ascii="Arial" w:hAnsi="Arial" w:cs="Arial"/>
+                <w:i/>
+                <w:lang w:val="en-PK"/>
+              </w:rPr>
+              <w:t>    global arrayTreasure</w:t>
+            </w:r>
+          </w:p>
+          <w:p>
+            <w:pPr>
+              <w:spacing w:after="0" w:line="240" w:lineRule="auto"/>
+              <w:rPr>
+                <w:rFonts w:ascii="Arial" w:hAnsi="Arial" w:cs="Arial"/>
+                <w:i/>
+                <w:lang w:val="en-PK"/>
+              </w:rPr>
+            </w:pPr>
+            <w:r>
+              <w:rPr>
+                <w:rFonts w:ascii="Arial" w:hAnsi="Arial" w:cs="Arial"/>
+                <w:i/>
+                <w:lang w:val="en-PK"/>
+              </w:rPr>
+              <w:t>    questions = []</w:t>
+            </w:r>
+          </w:p>
+          <w:p>
+            <w:pPr>
+              <w:spacing w:after="0" w:line="240" w:lineRule="auto"/>
+              <w:rPr>
+                <w:rFonts w:ascii="Arial" w:hAnsi="Arial" w:cs="Arial"/>
+                <w:i/>
+                <w:lang w:val="en-PK"/>
+              </w:rPr>
+            </w:pPr>
+            <w:r>
+              <w:rPr>
+                <w:rFonts w:ascii="Arial" w:hAnsi="Arial" w:cs="Arial"/>
+                <w:i/>
+                <w:lang w:val="en-PK"/>
+              </w:rPr>
+              <w:t>    answers = []</w:t>
+            </w:r>
+          </w:p>
+          <w:p>
+            <w:pPr>
+              <w:spacing w:after="0" w:line="240" w:lineRule="auto"/>
+              <w:rPr>
+                <w:rFonts w:ascii="Arial" w:hAnsi="Arial" w:cs="Arial"/>
+                <w:i/>
+                <w:lang w:val="en-PK"/>
+              </w:rPr>
+            </w:pPr>
+            <w:r>
+              <w:rPr>
+                <w:rFonts w:ascii="Arial" w:hAnsi="Arial" w:cs="Arial"/>
+                <w:i/>
+                <w:lang w:val="en-PK"/>
+              </w:rPr>
+              <w:t>    points = []</w:t>
+            </w:r>
+          </w:p>
+          <w:p>
+            <w:pPr>
+              <w:spacing w:after="0" w:line="240" w:lineRule="auto"/>
+              <w:rPr>
+                <w:rFonts w:ascii="Arial" w:hAnsi="Arial" w:cs="Arial"/>
+                <w:i/>
+                <w:lang w:val="en-PK"/>
+              </w:rPr>
+            </w:pPr>
+            <w:r>
+              <w:rPr>
+                <w:rFonts w:ascii="Arial" w:hAnsi="Arial" w:cs="Arial"/>
+                <w:i/>
+                <w:lang w:val="en-PK"/>
+              </w:rPr>
+              <w:t>    try:</w:t>
+            </w:r>
+          </w:p>
+          <w:p>
+            <w:pPr>
+              <w:spacing w:after="0" w:line="240" w:lineRule="auto"/>
+              <w:rPr>
+                <w:rFonts w:ascii="Arial" w:hAnsi="Arial" w:cs="Arial"/>
+                <w:i/>
+                <w:lang w:val="en-PK"/>
+              </w:rPr>
+            </w:pPr>
+            <w:r>
+              <w:rPr>
+                <w:rFonts w:ascii="Arial" w:hAnsi="Arial" w:cs="Arial"/>
+                <w:i/>
+                <w:lang w:val="en-PK"/>
+              </w:rPr>
+              <w:t xml:space="preserve">        file = </w:t>
+            </w:r>
+            <w:proofErr w:type="gramStart"/>
+            <w:r>
+              <w:rPr>
+                <w:rFonts w:ascii="Arial" w:hAnsi="Arial" w:cs="Arial"/>
+                <w:i/>
+                <w:lang w:val="en-PK"/>
+              </w:rPr>
+              <w:t>open(</w:t>
+            </w:r>
+            <w:proofErr w:type="gramEnd"/>
+          </w:p>
+          <w:p>
+            <w:pPr>
+              <w:spacing w:after="0" w:line="240" w:lineRule="auto"/>
+              <w:rPr>
+                <w:rFonts w:ascii="Arial" w:hAnsi="Arial" w:cs="Arial"/>
+                <w:i/>
+                <w:lang w:val="en-PK"/>
+              </w:rPr>
+            </w:pPr>
+            <w:r>
+              <w:rPr>
+                <w:rFonts w:ascii="Arial" w:hAnsi="Arial" w:cs="Arial"/>
+                <w:i/>
+                <w:lang w:val="en-PK"/>
+              </w:rPr>
+              <w:t>            "F:\\Data\\P4\\9618_s21_41\\9618_s21_sf_41\\06_9618_41_Confidential Source Files June 2021\\06_9618_41_Confidential Source Files June 2021\\TreasureChestData.txt",</w:t>
+            </w:r>
+          </w:p>
+          <w:p>
+            <w:pPr>
+              <w:spacing w:after="0" w:line="240" w:lineRule="auto"/>
+              <w:rPr>
+                <w:rFonts w:ascii="Arial" w:hAnsi="Arial" w:cs="Arial"/>
+                <w:i/>
+                <w:lang w:val="en-PK"/>
+              </w:rPr>
+            </w:pPr>
+            <w:r>
+              <w:rPr>
+                <w:rFonts w:ascii="Arial" w:hAnsi="Arial" w:cs="Arial"/>
+                <w:i/>
+                <w:lang w:val="en-PK"/>
+              </w:rPr>
+              <w:t>            "r",</w:t>
+            </w:r>
+          </w:p>
+          <w:p>
+            <w:pPr>
+              <w:spacing w:after="0" w:line="240" w:lineRule="auto"/>
+              <w:rPr>
+                <w:rFonts w:ascii="Arial" w:hAnsi="Arial" w:cs="Arial"/>
+                <w:i/>
+                <w:lang w:val="en-PK"/>
+              </w:rPr>
+            </w:pPr>
+            <w:r>
+              <w:rPr>
+                <w:rFonts w:ascii="Arial" w:hAnsi="Arial" w:cs="Arial"/>
+                <w:i/>
+                <w:lang w:val="en-PK"/>
+              </w:rPr>
+              <w:t>        )</w:t>
+            </w:r>
+          </w:p>
+          <w:p>
+            <w:pPr>
+              <w:spacing w:after="0" w:line="240" w:lineRule="auto"/>
+              <w:rPr>
+                <w:rFonts w:ascii="Arial" w:hAnsi="Arial" w:cs="Arial"/>
+                <w:i/>
+                <w:lang w:val="en-PK"/>
+              </w:rPr>
+            </w:pPr>
+            <w:r>
+              <w:rPr>
+                <w:rFonts w:ascii="Arial" w:hAnsi="Arial" w:cs="Arial"/>
+                <w:i/>
+                <w:lang w:val="en-PK"/>
+              </w:rPr>
+              <w:t>    except Exception as e:</w:t>
+            </w:r>
+          </w:p>
+          <w:p>
+            <w:pPr>
+              <w:spacing w:after="0" w:line="240" w:lineRule="auto"/>
+              <w:rPr>
+                <w:rFonts w:ascii="Arial" w:hAnsi="Arial" w:cs="Arial"/>
+                <w:i/>
+                <w:lang w:val="en-PK"/>
+              </w:rPr>
+            </w:pPr>
+            <w:r>
+              <w:rPr>
+                <w:rFonts w:ascii="Arial" w:hAnsi="Arial" w:cs="Arial"/>
+                <w:i/>
+                <w:lang w:val="en-PK"/>
+              </w:rPr>
+              <w:t xml:space="preserve">        </w:t>
+            </w:r>
+            <w:proofErr w:type="gramStart"/>
+            <w:r>
+              <w:rPr>
+                <w:rFonts w:ascii="Arial" w:hAnsi="Arial" w:cs="Arial"/>
+                <w:i/>
+                <w:lang w:val="en-PK"/>
+              </w:rPr>
+              <w:t>print(</w:t>
+            </w:r>
+            <w:proofErr w:type="gramEnd"/>
+            <w:r>
+              <w:rPr>
+                <w:rFonts w:ascii="Arial" w:hAnsi="Arial" w:cs="Arial"/>
+                <w:i/>
+                <w:lang w:val="en-PK"/>
+              </w:rPr>
+              <w:t>"Error: ", e)</w:t>
+            </w:r>
+          </w:p>
+          <w:p>
+            <w:pPr>
+              <w:spacing w:after="0" w:line="240" w:lineRule="auto"/>
+              <w:rPr>
+                <w:rFonts w:ascii="Arial" w:hAnsi="Arial" w:cs="Arial"/>
+                <w:i/>
+                <w:lang w:val="en-PK"/>
+              </w:rPr>
+            </w:pPr>
+            <w:r>
+              <w:rPr>
+                <w:rFonts w:ascii="Arial" w:hAnsi="Arial" w:cs="Arial"/>
+                <w:i/>
+                <w:lang w:val="en-PK"/>
+              </w:rPr>
+              <w:t>    else:</w:t>
+            </w:r>
+          </w:p>
+          <w:p>
+            <w:pPr>
+              <w:spacing w:after="0" w:line="240" w:lineRule="auto"/>
+              <w:rPr>
+                <w:rFonts w:ascii="Arial" w:hAnsi="Arial" w:cs="Arial"/>
+                <w:i/>
+                <w:lang w:val="en-PK"/>
+              </w:rPr>
+            </w:pPr>
+            <w:r>
+              <w:rPr>
+                <w:rFonts w:ascii="Arial" w:hAnsi="Arial" w:cs="Arial"/>
+                <w:i/>
+                <w:lang w:val="en-PK"/>
+              </w:rPr>
+              <w:t xml:space="preserve">        wholeFile = </w:t>
+            </w:r>
+            <w:proofErr w:type="gramStart"/>
+            <w:r>
+              <w:rPr>
+                <w:rFonts w:ascii="Arial" w:hAnsi="Arial" w:cs="Arial"/>
+                <w:i/>
+                <w:lang w:val="en-PK"/>
+              </w:rPr>
+              <w:t>file.read</w:t>
+            </w:r>
+            <w:proofErr w:type="gramEnd"/>
+            <w:r>
+              <w:rPr>
+                <w:rFonts w:ascii="Arial" w:hAnsi="Arial" w:cs="Arial"/>
+                <w:i/>
+                <w:lang w:val="en-PK"/>
+              </w:rPr>
+              <w:t>(</w:t>
+            </w:r>
+            <w:proofErr w:type="gramStart"/>
+            <w:r>
+              <w:rPr>
+                <w:rFonts w:ascii="Arial" w:hAnsi="Arial" w:cs="Arial"/>
+                <w:i/>
+                <w:lang w:val="en-PK"/>
+              </w:rPr>
+              <w:t>).splitlines</w:t>
+            </w:r>
+            <w:proofErr w:type="gramEnd"/>
+            <w:r>
+              <w:rPr>
+                <w:rFonts w:ascii="Arial" w:hAnsi="Arial" w:cs="Arial"/>
+                <w:i/>
+                <w:lang w:val="en-PK"/>
+              </w:rPr>
+              <w:t>()</w:t>
+            </w:r>
+          </w:p>
+          <w:p>
+            <w:pPr>
+              <w:spacing w:after="0" w:line="240" w:lineRule="auto"/>
+              <w:rPr>
+                <w:rFonts w:ascii="Arial" w:hAnsi="Arial" w:cs="Arial"/>
+                <w:i/>
+                <w:lang w:val="en-PK"/>
+              </w:rPr>
+            </w:pPr>
+            <w:r>
+              <w:rPr>
+                <w:rFonts w:ascii="Arial" w:hAnsi="Arial" w:cs="Arial"/>
+                <w:i/>
+                <w:lang w:val="en-PK"/>
+              </w:rPr>
+              <w:t xml:space="preserve">        for i in </w:t>
+            </w:r>
+            <w:proofErr w:type="gramStart"/>
+            <w:r>
+              <w:rPr>
+                <w:rFonts w:ascii="Arial" w:hAnsi="Arial" w:cs="Arial"/>
+                <w:i/>
+                <w:lang w:val="en-PK"/>
+              </w:rPr>
+              <w:t>range(</w:t>
+            </w:r>
+            <w:proofErr w:type="gramEnd"/>
+            <w:r>
+              <w:rPr>
+                <w:rFonts w:ascii="Arial" w:hAnsi="Arial" w:cs="Arial"/>
+                <w:i/>
+                <w:lang w:val="en-PK"/>
+              </w:rPr>
+              <w:t>0, len(wholeFile), 3):</w:t>
+            </w:r>
+          </w:p>
+          <w:p>
+            <w:pPr>
+              <w:spacing w:after="0" w:line="240" w:lineRule="auto"/>
+              <w:rPr>
+                <w:rFonts w:ascii="Arial" w:hAnsi="Arial" w:cs="Arial"/>
+                <w:i/>
+                <w:lang w:val="en-PK"/>
+              </w:rPr>
+            </w:pPr>
+            <w:r>
+              <w:rPr>
+                <w:rFonts w:ascii="Arial" w:hAnsi="Arial" w:cs="Arial"/>
+                <w:i/>
+                <w:lang w:val="en-PK"/>
+              </w:rPr>
+              <w:t xml:space="preserve">            </w:t>
+            </w:r>
+            <w:proofErr w:type="gramStart"/>
+            <w:r>
+              <w:rPr>
+                <w:rFonts w:ascii="Arial" w:hAnsi="Arial" w:cs="Arial"/>
+                <w:i/>
+                <w:lang w:val="en-PK"/>
+              </w:rPr>
+              <w:t>questions.append</w:t>
+            </w:r>
+            <w:proofErr w:type="gramEnd"/>
+            <w:r>
+              <w:rPr>
+                <w:rFonts w:ascii="Arial" w:hAnsi="Arial" w:cs="Arial"/>
+                <w:i/>
+                <w:lang w:val="en-PK"/>
+              </w:rPr>
+              <w:t>(wholeFile[i])</w:t>
+            </w:r>
+          </w:p>
+          <w:p>
+            <w:pPr>
+              <w:spacing w:after="0" w:line="240" w:lineRule="auto"/>
+              <w:rPr>
+                <w:rFonts w:ascii="Arial" w:hAnsi="Arial" w:cs="Arial"/>
+                <w:i/>
+                <w:lang w:val="en-PK"/>
+              </w:rPr>
+            </w:pPr>
+            <w:r>
+              <w:rPr>
+                <w:rFonts w:ascii="Arial" w:hAnsi="Arial" w:cs="Arial"/>
+                <w:i/>
+                <w:lang w:val="en-PK"/>
+              </w:rPr>
+              <w:t>            # print(questions)</w:t>
+            </w:r>
+          </w:p>
+          <w:p>
+            <w:pPr>
+              <w:spacing w:after="0" w:line="240" w:lineRule="auto"/>
+              <w:rPr>
+                <w:rFonts w:ascii="Arial" w:hAnsi="Arial" w:cs="Arial"/>
+                <w:i/>
+                <w:lang w:val="en-PK"/>
+              </w:rPr>
+            </w:pPr>
+            <w:r>
+              <w:rPr>
+                <w:rFonts w:ascii="Arial" w:hAnsi="Arial" w:cs="Arial"/>
+                <w:i/>
+                <w:lang w:val="en-PK"/>
+              </w:rPr>
+              <w:t xml:space="preserve">        for i in </w:t>
+            </w:r>
+            <w:proofErr w:type="gramStart"/>
+            <w:r>
+              <w:rPr>
+                <w:rFonts w:ascii="Arial" w:hAnsi="Arial" w:cs="Arial"/>
+                <w:i/>
+                <w:lang w:val="en-PK"/>
+              </w:rPr>
+              <w:t>range(</w:t>
+            </w:r>
+            <w:proofErr w:type="gramEnd"/>
+            <w:r>
+              <w:rPr>
+                <w:rFonts w:ascii="Arial" w:hAnsi="Arial" w:cs="Arial"/>
+                <w:i/>
+                <w:lang w:val="en-PK"/>
+              </w:rPr>
+              <w:t>1, len(wholeFile), 3):</w:t>
+            </w:r>
+          </w:p>
+          <w:p>
+            <w:pPr>
+              <w:spacing w:after="0" w:line="240" w:lineRule="auto"/>
+              <w:rPr>
+                <w:rFonts w:ascii="Arial" w:hAnsi="Arial" w:cs="Arial"/>
+                <w:i/>
+                <w:lang w:val="en-PK"/>
+              </w:rPr>
+            </w:pPr>
+            <w:r>
+              <w:rPr>
+                <w:rFonts w:ascii="Arial" w:hAnsi="Arial" w:cs="Arial"/>
+                <w:i/>
+                <w:lang w:val="en-PK"/>
+              </w:rPr>
+              <w:t xml:space="preserve">            </w:t>
+            </w:r>
+            <w:proofErr w:type="gramStart"/>
+            <w:r>
+              <w:rPr>
+                <w:rFonts w:ascii="Arial" w:hAnsi="Arial" w:cs="Arial"/>
+                <w:i/>
+                <w:lang w:val="en-PK"/>
+              </w:rPr>
+              <w:t>answers.append</w:t>
+            </w:r>
+            <w:proofErr w:type="gramEnd"/>
+            <w:r>
+              <w:rPr>
+                <w:rFonts w:ascii="Arial" w:hAnsi="Arial" w:cs="Arial"/>
+                <w:i/>
+                <w:lang w:val="en-PK"/>
+              </w:rPr>
+              <w:t>(int(wholeFile[i]))</w:t>
+            </w:r>
+          </w:p>
+          <w:p>
+            <w:pPr>
+              <w:spacing w:after="0" w:line="240" w:lineRule="auto"/>
+              <w:rPr>
+                <w:rFonts w:ascii="Arial" w:hAnsi="Arial" w:cs="Arial"/>
+                <w:i/>
+                <w:lang w:val="en-PK"/>
+              </w:rPr>
+            </w:pPr>
+            <w:r>
+              <w:rPr>
+                <w:rFonts w:ascii="Arial" w:hAnsi="Arial" w:cs="Arial"/>
+                <w:i/>
+                <w:lang w:val="en-PK"/>
+              </w:rPr>
+              <w:t>            # print(answers)</w:t>
+            </w:r>
+          </w:p>
+          <w:p>
+            <w:pPr>
+              <w:spacing w:after="0" w:line="240" w:lineRule="auto"/>
+              <w:rPr>
+                <w:rFonts w:ascii="Arial" w:hAnsi="Arial" w:cs="Arial"/>
+                <w:i/>
+                <w:lang w:val="en-PK"/>
+              </w:rPr>
+            </w:pPr>
+            <w:r>
+              <w:rPr>
+                <w:rFonts w:ascii="Arial" w:hAnsi="Arial" w:cs="Arial"/>
+                <w:i/>
+                <w:lang w:val="en-PK"/>
+              </w:rPr>
+              <w:t xml:space="preserve">        for i in </w:t>
+            </w:r>
+            <w:proofErr w:type="gramStart"/>
+            <w:r>
+              <w:rPr>
+                <w:rFonts w:ascii="Arial" w:hAnsi="Arial" w:cs="Arial"/>
+                <w:i/>
+                <w:lang w:val="en-PK"/>
+              </w:rPr>
+              <w:t>range(</w:t>
+            </w:r>
+            <w:proofErr w:type="gramEnd"/>
+            <w:r>
+              <w:rPr>
+                <w:rFonts w:ascii="Arial" w:hAnsi="Arial" w:cs="Arial"/>
+                <w:i/>
+                <w:lang w:val="en-PK"/>
+              </w:rPr>
+              <w:t>2, len(wholeFile), 3):</w:t>
+            </w:r>
+          </w:p>
+          <w:p>
+            <w:pPr>
+              <w:spacing w:after="0" w:line="240" w:lineRule="auto"/>
+              <w:rPr>
+                <w:rFonts w:ascii="Arial" w:hAnsi="Arial" w:cs="Arial"/>
+                <w:i/>
+                <w:lang w:val="en-PK"/>
+              </w:rPr>
+            </w:pPr>
+            <w:r>
+              <w:rPr>
+                <w:rFonts w:ascii="Arial" w:hAnsi="Arial" w:cs="Arial"/>
+                <w:i/>
+                <w:lang w:val="en-PK"/>
+              </w:rPr>
+              <w:t xml:space="preserve">            </w:t>
+            </w:r>
+            <w:proofErr w:type="gramStart"/>
+            <w:r>
+              <w:rPr>
+                <w:rFonts w:ascii="Arial" w:hAnsi="Arial" w:cs="Arial"/>
+                <w:i/>
+                <w:lang w:val="en-PK"/>
+              </w:rPr>
+              <w:t>points.append</w:t>
+            </w:r>
+            <w:proofErr w:type="gramEnd"/>
+            <w:r>
+              <w:rPr>
+                <w:rFonts w:ascii="Arial" w:hAnsi="Arial" w:cs="Arial"/>
+                <w:i/>
+                <w:lang w:val="en-PK"/>
+              </w:rPr>
+              <w:t>(int(wholeFile[i]))</w:t>
+            </w:r>
+          </w:p>
+          <w:p>
+            <w:pPr>
+              <w:spacing w:after="0" w:line="240" w:lineRule="auto"/>
+              <w:rPr>
+                <w:rFonts w:ascii="Arial" w:hAnsi="Arial" w:cs="Arial"/>
+                <w:i/>
+                <w:lang w:val="en-PK"/>
+              </w:rPr>
+            </w:pPr>
+            <w:r>
+              <w:rPr>
+                <w:rFonts w:ascii="Arial" w:hAnsi="Arial" w:cs="Arial"/>
+                <w:i/>
+                <w:lang w:val="en-PK"/>
+              </w:rPr>
+              <w:t>            # print(points)</w:t>
+            </w:r>
+          </w:p>
+          <w:p>
+            <w:pPr>
+              <w:spacing w:after="0" w:line="240" w:lineRule="auto"/>
+              <w:rPr>
+                <w:rFonts w:ascii="Arial" w:hAnsi="Arial" w:cs="Arial"/>
+                <w:i/>
+                <w:lang w:val="en-PK"/>
+              </w:rPr>
+            </w:pPr>
+          </w:p>
+          <w:p>
+            <w:pPr>
+              <w:spacing w:after="0" w:line="240" w:lineRule="auto"/>
+              <w:rPr>
+                <w:rFonts w:ascii="Arial" w:hAnsi="Arial" w:cs="Arial"/>
+                <w:i/>
+                <w:lang w:val="en-PK"/>
+              </w:rPr>
+            </w:pPr>
+            <w:r>
+              <w:rPr>
+                <w:rFonts w:ascii="Arial" w:hAnsi="Arial" w:cs="Arial"/>
+                <w:i/>
+                <w:lang w:val="en-PK"/>
+              </w:rPr>
+              <w:t>    for i in range(len(questions)):</w:t>
+            </w:r>
+          </w:p>
+          <w:p>
+            <w:pPr>
+              <w:spacing w:after="0" w:line="240" w:lineRule="auto"/>
+              <w:rPr>
+                <w:rFonts w:ascii="Arial" w:hAnsi="Arial" w:cs="Arial"/>
+                <w:i/>
+                <w:lang w:val="en-PK"/>
+              </w:rPr>
+            </w:pPr>
+            <w:r>
+              <w:rPr>
+                <w:rFonts w:ascii="Arial" w:hAnsi="Arial" w:cs="Arial"/>
+                <w:i/>
+                <w:lang w:val="en-PK"/>
+              </w:rPr>
+              <w:t>        arrayTreasure.append(TreasureChest(questions[i], answers[i], points[i]))</w:t>
+            </w:r>
+          </w:p>
+          <w:p>
+            <w:pPr>
+              <w:spacing w:after="0" w:line="240" w:lineRule="auto"/>
+              <w:rPr>
+                <w:rFonts w:ascii="Arial" w:hAnsi="Arial" w:cs="Arial"/>
+                <w:i/>
+                <w:lang w:val="en-PK"/>
+              </w:rPr>
+            </w:pPr>
+            <w:r>
+              <w:rPr>
+                <w:rFonts w:ascii="Arial" w:hAnsi="Arial" w:cs="Arial"/>
+                <w:i/>
+                <w:lang w:val="en-PK"/>
+              </w:rPr>
+              <w:t>        # print(</w:t>
+            </w:r>
+            <w:proofErr w:type="gramStart"/>
+            <w:r>
+              <w:rPr>
+                <w:rFonts w:ascii="Arial" w:hAnsi="Arial" w:cs="Arial"/>
+                <w:i/>
+                <w:lang w:val="en-PK"/>
+              </w:rPr>
+              <w:t>arrayTreasure._</w:t>
+            </w:r>
+            <w:proofErr w:type="gramEnd"/>
+            <w:r>
+              <w:rPr>
+                <w:rFonts w:ascii="Arial" w:hAnsi="Arial" w:cs="Arial"/>
+                <w:i/>
+                <w:lang w:val="en-PK"/>
+              </w:rPr>
+              <w:t>_question)</w:t>
+            </w:r>
           </w:p>
           <w:p>
             <w:pPr>
@@ -4460,19 +3787,8 @@
                 <w:sz w:val="28"/>
                 <w:szCs w:val="28"/>
               </w:rPr>
-              <w:t>c)(</w:t>
-            </w:r>
-            <w:proofErr w:type="spellStart"/>
-            <w:r>
-              <w:rPr>
-                <w:rFonts w:ascii="Arial" w:hAnsi="Arial" w:cs="Arial"/>
-                <w:b/>
-                <w:sz w:val="28"/>
-                <w:szCs w:val="28"/>
-              </w:rPr>
-              <w:t>i</w:t>
-            </w:r>
-            <w:proofErr w:type="spellEnd"/>
+              <w:t>c)(i</w:t>
+            </w:r>
             <w:r>
               <w:rPr>
                 <w:rFonts w:ascii="Arial" w:hAnsi="Arial" w:cs="Arial"/>
@@ -4496,90 +3812,53 @@
               <w:rPr>
                 <w:rFonts w:ascii="Arial" w:hAnsi="Arial" w:cs="Arial"/>
                 <w:i/>
-              </w:rPr>
-            </w:pPr>
-            <w:r>
-              <w:rPr>
-                <w:rFonts w:ascii="Arial" w:hAnsi="Arial" w:cs="Arial"/>
-                <w:i/>
-              </w:rPr>
-              <w:t xml:space="preserve">{Copy and paste program code listing for question </w:t>
-            </w:r>
-            <w:r>
-              <w:rPr>
-                <w:rFonts w:ascii="Arial" w:hAnsi="Arial" w:cs="Arial"/>
-                <w:i/>
-              </w:rPr>
-              <w:t>3(c)(</w:t>
-            </w:r>
-            <w:proofErr w:type="spellStart"/>
-            <w:r>
-              <w:rPr>
-                <w:rFonts w:ascii="Arial" w:hAnsi="Arial" w:cs="Arial"/>
-                <w:i/>
-              </w:rPr>
-              <w:t>i</w:t>
-            </w:r>
-            <w:proofErr w:type="spellEnd"/>
-            <w:r>
-              <w:rPr>
-                <w:rFonts w:ascii="Arial" w:hAnsi="Arial" w:cs="Arial"/>
-                <w:i/>
-              </w:rPr>
-              <w:t>)</w:t>
-            </w:r>
-            <w:r>
-              <w:rPr>
-                <w:rFonts w:ascii="Arial" w:hAnsi="Arial" w:cs="Arial"/>
-                <w:i/>
-              </w:rPr>
-              <w:t xml:space="preserve"> here}</w:t>
-            </w:r>
-          </w:p>
-          <w:p>
-            <w:pPr>
-              <w:spacing w:after="0" w:line="240" w:lineRule="auto"/>
-              <w:rPr>
-                <w:rFonts w:ascii="Arial" w:hAnsi="Arial" w:cs="Arial"/>
-                <w:i/>
-              </w:rPr>
-            </w:pPr>
-          </w:p>
-          <w:p>
-            <w:pPr>
-              <w:spacing w:after="0" w:line="240" w:lineRule="auto"/>
-              <w:rPr>
-                <w:rFonts w:ascii="Arial" w:hAnsi="Arial" w:cs="Arial"/>
-                <w:i/>
-              </w:rPr>
-            </w:pPr>
-          </w:p>
-          <w:p>
-            <w:pPr>
-              <w:spacing w:after="0" w:line="240" w:lineRule="auto"/>
-              <w:rPr>
-                <w:rFonts w:ascii="Arial" w:hAnsi="Arial" w:cs="Arial"/>
-                <w:i/>
-              </w:rPr>
-            </w:pPr>
-          </w:p>
-          <w:p>
-            <w:pPr>
-              <w:spacing w:after="0" w:line="240" w:lineRule="auto"/>
-              <w:rPr>
-                <w:rFonts w:ascii="Arial" w:hAnsi="Arial" w:cs="Arial"/>
-                <w:i/>
-              </w:rPr>
-            </w:pPr>
-          </w:p>
-          <w:p>
-            <w:pPr>
-              <w:spacing w:after="0" w:line="240" w:lineRule="auto"/>
-              <w:rPr>
-                <w:rFonts w:ascii="Arial" w:hAnsi="Arial" w:cs="Arial"/>
-                <w:i/>
-              </w:rPr>
-            </w:pPr>
+                <w:lang w:val="en-PK"/>
+              </w:rPr>
+            </w:pPr>
+            <w:r>
+              <w:rPr>
+                <w:rFonts w:ascii="Arial" w:hAnsi="Arial" w:cs="Arial"/>
+                <w:i/>
+                <w:lang w:val="en-PK"/>
+              </w:rPr>
+              <w:t>    def getQuestion(self):</w:t>
+            </w:r>
+          </w:p>
+          <w:p>
+            <w:pPr>
+              <w:spacing w:after="0" w:line="240" w:lineRule="auto"/>
+              <w:rPr>
+                <w:rFonts w:ascii="Arial" w:hAnsi="Arial" w:cs="Arial"/>
+                <w:i/>
+                <w:lang w:val="en-PK"/>
+              </w:rPr>
+            </w:pPr>
+            <w:r>
+              <w:rPr>
+                <w:rFonts w:ascii="Arial" w:hAnsi="Arial" w:cs="Arial"/>
+                <w:i/>
+                <w:lang w:val="en-PK"/>
+              </w:rPr>
+              <w:t xml:space="preserve">        return </w:t>
+            </w:r>
+            <w:proofErr w:type="gramStart"/>
+            <w:r>
+              <w:rPr>
+                <w:rFonts w:ascii="Arial" w:hAnsi="Arial" w:cs="Arial"/>
+                <w:i/>
+                <w:lang w:val="en-PK"/>
+              </w:rPr>
+              <w:t>self._</w:t>
+            </w:r>
+            <w:proofErr w:type="gramEnd"/>
+            <w:r>
+              <w:rPr>
+                <w:rFonts w:ascii="Arial" w:hAnsi="Arial" w:cs="Arial"/>
+                <w:i/>
+                <w:lang w:val="en-PK"/>
+              </w:rPr>
+              <w:t>_question</w:t>
+            </w:r>
           </w:p>
           <w:p>
             <w:pPr>
@@ -4656,74 +3935,71 @@
               <w:rPr>
                 <w:rFonts w:ascii="Arial" w:hAnsi="Arial" w:cs="Arial"/>
                 <w:i/>
-              </w:rPr>
-            </w:pPr>
-            <w:r>
-              <w:rPr>
-                <w:rFonts w:ascii="Arial" w:hAnsi="Arial" w:cs="Arial"/>
-                <w:i/>
-              </w:rPr>
-              <w:t xml:space="preserve">{Copy and paste program code listing for question </w:t>
-            </w:r>
-            <w:r>
-              <w:rPr>
-                <w:rFonts w:ascii="Arial" w:hAnsi="Arial" w:cs="Arial"/>
-                <w:i/>
-              </w:rPr>
-              <w:t>3(c)(ii)</w:t>
-            </w:r>
-            <w:r>
-              <w:rPr>
-                <w:rFonts w:ascii="Arial" w:hAnsi="Arial" w:cs="Arial"/>
-                <w:i/>
-              </w:rPr>
-              <w:t xml:space="preserve"> here}</w:t>
-            </w:r>
-          </w:p>
-          <w:p>
-            <w:pPr>
-              <w:spacing w:after="0" w:line="240" w:lineRule="auto"/>
-              <w:rPr>
-                <w:rFonts w:ascii="Arial" w:hAnsi="Arial" w:cs="Arial"/>
-                <w:i/>
-              </w:rPr>
-            </w:pPr>
-          </w:p>
-          <w:p>
-            <w:pPr>
-              <w:spacing w:after="0" w:line="240" w:lineRule="auto"/>
-              <w:rPr>
-                <w:rFonts w:ascii="Arial" w:hAnsi="Arial" w:cs="Arial"/>
-                <w:i/>
-              </w:rPr>
-            </w:pPr>
-          </w:p>
-          <w:p>
-            <w:pPr>
-              <w:spacing w:after="0" w:line="240" w:lineRule="auto"/>
-              <w:rPr>
-                <w:rFonts w:ascii="Arial" w:hAnsi="Arial" w:cs="Arial"/>
-                <w:i/>
-              </w:rPr>
-            </w:pPr>
-          </w:p>
-          <w:p>
-            <w:pPr>
-              <w:spacing w:after="0" w:line="240" w:lineRule="auto"/>
-              <w:rPr>
-                <w:rFonts w:ascii="Arial" w:hAnsi="Arial" w:cs="Arial"/>
-                <w:i/>
-              </w:rPr>
-            </w:pPr>
-          </w:p>
-          <w:p>
-            <w:pPr>
-              <w:spacing w:after="0" w:line="240" w:lineRule="auto"/>
-              <w:rPr>
-                <w:rFonts w:ascii="Arial" w:hAnsi="Arial" w:cs="Arial"/>
-                <w:i/>
-              </w:rPr>
-            </w:pPr>
+                <w:lang w:val="en-PK"/>
+              </w:rPr>
+            </w:pPr>
+            <w:r>
+              <w:rPr>
+                <w:rFonts w:ascii="Arial" w:hAnsi="Arial" w:cs="Arial"/>
+                <w:i/>
+                <w:lang w:val="en-PK"/>
+              </w:rPr>
+              <w:t xml:space="preserve">    def </w:t>
+            </w:r>
+            <w:proofErr w:type="gramStart"/>
+            <w:r>
+              <w:rPr>
+                <w:rFonts w:ascii="Arial" w:hAnsi="Arial" w:cs="Arial"/>
+                <w:i/>
+                <w:lang w:val="en-PK"/>
+              </w:rPr>
+              <w:t>checkAnswer(</w:t>
+            </w:r>
+            <w:proofErr w:type="gramEnd"/>
+            <w:r>
+              <w:rPr>
+                <w:rFonts w:ascii="Arial" w:hAnsi="Arial" w:cs="Arial"/>
+                <w:i/>
+                <w:lang w:val="en-PK"/>
+              </w:rPr>
+              <w:t>self, ans):</w:t>
+            </w:r>
+          </w:p>
+          <w:p>
+            <w:pPr>
+              <w:spacing w:after="0" w:line="240" w:lineRule="auto"/>
+              <w:rPr>
+                <w:rFonts w:ascii="Arial" w:hAnsi="Arial" w:cs="Arial"/>
+                <w:i/>
+                <w:lang w:val="en-PK"/>
+              </w:rPr>
+            </w:pPr>
+            <w:r>
+              <w:rPr>
+                <w:rFonts w:ascii="Arial" w:hAnsi="Arial" w:cs="Arial"/>
+                <w:i/>
+                <w:lang w:val="en-PK"/>
+              </w:rPr>
+              <w:t xml:space="preserve">        return </w:t>
+            </w:r>
+            <w:proofErr w:type="gramStart"/>
+            <w:r>
+              <w:rPr>
+                <w:rFonts w:ascii="Arial" w:hAnsi="Arial" w:cs="Arial"/>
+                <w:i/>
+                <w:lang w:val="en-PK"/>
+              </w:rPr>
+              <w:t>self._</w:t>
+            </w:r>
+            <w:proofErr w:type="gramEnd"/>
+            <w:r>
+              <w:rPr>
+                <w:rFonts w:ascii="Arial" w:hAnsi="Arial" w:cs="Arial"/>
+                <w:i/>
+                <w:lang w:val="en-PK"/>
+              </w:rPr>
+              <w:t>_answer == ans</w:t>
+            </w:r>
           </w:p>
           <w:p>
             <w:pPr>
@@ -4812,74 +4088,306 @@
               <w:rPr>
                 <w:rFonts w:ascii="Arial" w:hAnsi="Arial" w:cs="Arial"/>
                 <w:i/>
-              </w:rPr>
-            </w:pPr>
-            <w:r>
-              <w:rPr>
-                <w:rFonts w:ascii="Arial" w:hAnsi="Arial" w:cs="Arial"/>
-                <w:i/>
-              </w:rPr>
-              <w:t>{Copy and paste program code listing for question 3(c)</w:t>
-            </w:r>
-            <w:r>
-              <w:rPr>
-                <w:rFonts w:ascii="Arial" w:hAnsi="Arial" w:cs="Arial"/>
-                <w:i/>
-              </w:rPr>
-              <w:t>(iii)</w:t>
-            </w:r>
-            <w:r>
-              <w:rPr>
-                <w:rFonts w:ascii="Arial" w:hAnsi="Arial" w:cs="Arial"/>
-                <w:i/>
-              </w:rPr>
-              <w:t xml:space="preserve"> here}</w:t>
-            </w:r>
-          </w:p>
-          <w:p>
-            <w:pPr>
-              <w:spacing w:after="0" w:line="240" w:lineRule="auto"/>
-              <w:rPr>
-                <w:rFonts w:ascii="Arial" w:hAnsi="Arial" w:cs="Arial"/>
-                <w:i/>
-              </w:rPr>
-            </w:pPr>
-          </w:p>
-          <w:p>
-            <w:pPr>
-              <w:spacing w:after="0" w:line="240" w:lineRule="auto"/>
-              <w:rPr>
-                <w:rFonts w:ascii="Arial" w:hAnsi="Arial" w:cs="Arial"/>
-                <w:i/>
-              </w:rPr>
-            </w:pPr>
-          </w:p>
-          <w:p>
-            <w:pPr>
-              <w:spacing w:after="0" w:line="240" w:lineRule="auto"/>
-              <w:rPr>
-                <w:rFonts w:ascii="Arial" w:hAnsi="Arial" w:cs="Arial"/>
-                <w:i/>
-              </w:rPr>
-            </w:pPr>
-          </w:p>
-          <w:p>
-            <w:pPr>
-              <w:spacing w:after="0" w:line="240" w:lineRule="auto"/>
-              <w:rPr>
-                <w:rFonts w:ascii="Arial" w:hAnsi="Arial" w:cs="Arial"/>
-                <w:i/>
-              </w:rPr>
-            </w:pPr>
-          </w:p>
-          <w:p>
-            <w:pPr>
-              <w:spacing w:after="0" w:line="240" w:lineRule="auto"/>
-              <w:rPr>
-                <w:rFonts w:ascii="Arial" w:hAnsi="Arial" w:cs="Arial"/>
-                <w:i/>
-              </w:rPr>
-            </w:pPr>
+                <w:lang w:val="en-PK"/>
+              </w:rPr>
+            </w:pPr>
+            <w:r>
+              <w:rPr>
+                <w:rFonts w:ascii="Arial" w:hAnsi="Arial" w:cs="Arial"/>
+                <w:i/>
+                <w:lang w:val="en-PK"/>
+              </w:rPr>
+              <w:t xml:space="preserve">    def </w:t>
+            </w:r>
+            <w:proofErr w:type="gramStart"/>
+            <w:r>
+              <w:rPr>
+                <w:rFonts w:ascii="Arial" w:hAnsi="Arial" w:cs="Arial"/>
+                <w:i/>
+                <w:lang w:val="en-PK"/>
+              </w:rPr>
+              <w:t>getPoints(</w:t>
+            </w:r>
+            <w:proofErr w:type="gramEnd"/>
+            <w:r>
+              <w:rPr>
+                <w:rFonts w:ascii="Arial" w:hAnsi="Arial" w:cs="Arial"/>
+                <w:i/>
+                <w:lang w:val="en-PK"/>
+              </w:rPr>
+              <w:t>self, numAttempt):</w:t>
+            </w:r>
+          </w:p>
+          <w:p>
+            <w:pPr>
+              <w:spacing w:after="0" w:line="240" w:lineRule="auto"/>
+              <w:rPr>
+                <w:rFonts w:ascii="Arial" w:hAnsi="Arial" w:cs="Arial"/>
+                <w:i/>
+                <w:lang w:val="en-PK"/>
+              </w:rPr>
+            </w:pPr>
+            <w:r>
+              <w:rPr>
+                <w:rFonts w:ascii="Arial" w:hAnsi="Arial" w:cs="Arial"/>
+                <w:i/>
+                <w:lang w:val="en-PK"/>
+              </w:rPr>
+              <w:t>        match numAttempt:</w:t>
+            </w:r>
+          </w:p>
+          <w:p>
+            <w:pPr>
+              <w:spacing w:after="0" w:line="240" w:lineRule="auto"/>
+              <w:rPr>
+                <w:rFonts w:ascii="Arial" w:hAnsi="Arial" w:cs="Arial"/>
+                <w:i/>
+                <w:lang w:val="en-PK"/>
+              </w:rPr>
+            </w:pPr>
+            <w:r>
+              <w:rPr>
+                <w:rFonts w:ascii="Arial" w:hAnsi="Arial" w:cs="Arial"/>
+                <w:i/>
+                <w:lang w:val="en-PK"/>
+              </w:rPr>
+              <w:lastRenderedPageBreak/>
+              <w:t>            case 1:</w:t>
+            </w:r>
+          </w:p>
+          <w:p>
+            <w:pPr>
+              <w:spacing w:after="0" w:line="240" w:lineRule="auto"/>
+              <w:rPr>
+                <w:rFonts w:ascii="Arial" w:hAnsi="Arial" w:cs="Arial"/>
+                <w:i/>
+                <w:lang w:val="en-PK"/>
+              </w:rPr>
+            </w:pPr>
+            <w:r>
+              <w:rPr>
+                <w:rFonts w:ascii="Arial" w:hAnsi="Arial" w:cs="Arial"/>
+                <w:i/>
+                <w:lang w:val="en-PK"/>
+              </w:rPr>
+              <w:t xml:space="preserve">                return </w:t>
+            </w:r>
+            <w:proofErr w:type="gramStart"/>
+            <w:r>
+              <w:rPr>
+                <w:rFonts w:ascii="Arial" w:hAnsi="Arial" w:cs="Arial"/>
+                <w:i/>
+                <w:lang w:val="en-PK"/>
+              </w:rPr>
+              <w:t>self._</w:t>
+            </w:r>
+            <w:proofErr w:type="gramEnd"/>
+            <w:r>
+              <w:rPr>
+                <w:rFonts w:ascii="Arial" w:hAnsi="Arial" w:cs="Arial"/>
+                <w:i/>
+                <w:lang w:val="en-PK"/>
+              </w:rPr>
+              <w:t>_points</w:t>
+            </w:r>
+          </w:p>
+          <w:p>
+            <w:pPr>
+              <w:spacing w:after="0" w:line="240" w:lineRule="auto"/>
+              <w:rPr>
+                <w:rFonts w:ascii="Arial" w:hAnsi="Arial" w:cs="Arial"/>
+                <w:i/>
+                <w:lang w:val="en-PK"/>
+              </w:rPr>
+            </w:pPr>
+            <w:r>
+              <w:rPr>
+                <w:rFonts w:ascii="Arial" w:hAnsi="Arial" w:cs="Arial"/>
+                <w:i/>
+                <w:lang w:val="en-PK"/>
+              </w:rPr>
+              <w:t>            case 2:</w:t>
+            </w:r>
+          </w:p>
+          <w:p>
+            <w:pPr>
+              <w:spacing w:after="0" w:line="240" w:lineRule="auto"/>
+              <w:rPr>
+                <w:rFonts w:ascii="Arial" w:hAnsi="Arial" w:cs="Arial"/>
+                <w:i/>
+                <w:lang w:val="en-PK"/>
+              </w:rPr>
+            </w:pPr>
+            <w:r>
+              <w:rPr>
+                <w:rFonts w:ascii="Arial" w:hAnsi="Arial" w:cs="Arial"/>
+                <w:i/>
+                <w:lang w:val="en-PK"/>
+              </w:rPr>
+              <w:t xml:space="preserve">                return </w:t>
+            </w:r>
+            <w:proofErr w:type="gramStart"/>
+            <w:r>
+              <w:rPr>
+                <w:rFonts w:ascii="Arial" w:hAnsi="Arial" w:cs="Arial"/>
+                <w:i/>
+                <w:lang w:val="en-PK"/>
+              </w:rPr>
+              <w:t>self._</w:t>
+            </w:r>
+            <w:proofErr w:type="gramEnd"/>
+            <w:r>
+              <w:rPr>
+                <w:rFonts w:ascii="Arial" w:hAnsi="Arial" w:cs="Arial"/>
+                <w:i/>
+                <w:lang w:val="en-PK"/>
+              </w:rPr>
+              <w:t>_points // 2</w:t>
+            </w:r>
+          </w:p>
+          <w:p>
+            <w:pPr>
+              <w:spacing w:after="0" w:line="240" w:lineRule="auto"/>
+              <w:rPr>
+                <w:rFonts w:ascii="Arial" w:hAnsi="Arial" w:cs="Arial"/>
+                <w:i/>
+                <w:lang w:val="en-PK"/>
+              </w:rPr>
+            </w:pPr>
+            <w:r>
+              <w:rPr>
+                <w:rFonts w:ascii="Arial" w:hAnsi="Arial" w:cs="Arial"/>
+                <w:i/>
+                <w:lang w:val="en-PK"/>
+              </w:rPr>
+              <w:t>            case 3:</w:t>
+            </w:r>
+          </w:p>
+          <w:p>
+            <w:pPr>
+              <w:spacing w:after="0" w:line="240" w:lineRule="auto"/>
+              <w:rPr>
+                <w:rFonts w:ascii="Arial" w:hAnsi="Arial" w:cs="Arial"/>
+                <w:i/>
+                <w:lang w:val="en-PK"/>
+              </w:rPr>
+            </w:pPr>
+            <w:r>
+              <w:rPr>
+                <w:rFonts w:ascii="Arial" w:hAnsi="Arial" w:cs="Arial"/>
+                <w:i/>
+                <w:lang w:val="en-PK"/>
+              </w:rPr>
+              <w:t xml:space="preserve">                return </w:t>
+            </w:r>
+            <w:proofErr w:type="gramStart"/>
+            <w:r>
+              <w:rPr>
+                <w:rFonts w:ascii="Arial" w:hAnsi="Arial" w:cs="Arial"/>
+                <w:i/>
+                <w:lang w:val="en-PK"/>
+              </w:rPr>
+              <w:t>self._</w:t>
+            </w:r>
+            <w:proofErr w:type="gramEnd"/>
+            <w:r>
+              <w:rPr>
+                <w:rFonts w:ascii="Arial" w:hAnsi="Arial" w:cs="Arial"/>
+                <w:i/>
+                <w:lang w:val="en-PK"/>
+              </w:rPr>
+              <w:t>_points // 4</w:t>
+            </w:r>
+          </w:p>
+          <w:p>
+            <w:pPr>
+              <w:spacing w:after="0" w:line="240" w:lineRule="auto"/>
+              <w:rPr>
+                <w:rFonts w:ascii="Arial" w:hAnsi="Arial" w:cs="Arial"/>
+                <w:i/>
+                <w:lang w:val="en-PK"/>
+              </w:rPr>
+            </w:pPr>
+            <w:r>
+              <w:rPr>
+                <w:rFonts w:ascii="Arial" w:hAnsi="Arial" w:cs="Arial"/>
+                <w:i/>
+                <w:lang w:val="en-PK"/>
+              </w:rPr>
+              <w:t>            case 4:</w:t>
+            </w:r>
+          </w:p>
+          <w:p>
+            <w:pPr>
+              <w:spacing w:after="0" w:line="240" w:lineRule="auto"/>
+              <w:rPr>
+                <w:rFonts w:ascii="Arial" w:hAnsi="Arial" w:cs="Arial"/>
+                <w:i/>
+                <w:lang w:val="en-PK"/>
+              </w:rPr>
+            </w:pPr>
+            <w:r>
+              <w:rPr>
+                <w:rFonts w:ascii="Arial" w:hAnsi="Arial" w:cs="Arial"/>
+                <w:i/>
+                <w:lang w:val="en-PK"/>
+              </w:rPr>
+              <w:t xml:space="preserve">                return </w:t>
+            </w:r>
+            <w:proofErr w:type="gramStart"/>
+            <w:r>
+              <w:rPr>
+                <w:rFonts w:ascii="Arial" w:hAnsi="Arial" w:cs="Arial"/>
+                <w:i/>
+                <w:lang w:val="en-PK"/>
+              </w:rPr>
+              <w:t>self._</w:t>
+            </w:r>
+            <w:proofErr w:type="gramEnd"/>
+            <w:r>
+              <w:rPr>
+                <w:rFonts w:ascii="Arial" w:hAnsi="Arial" w:cs="Arial"/>
+                <w:i/>
+                <w:lang w:val="en-PK"/>
+              </w:rPr>
+              <w:t>_points // 4</w:t>
+            </w:r>
+          </w:p>
+          <w:p>
+            <w:pPr>
+              <w:spacing w:after="0" w:line="240" w:lineRule="auto"/>
+              <w:rPr>
+                <w:rFonts w:ascii="Arial" w:hAnsi="Arial" w:cs="Arial"/>
+                <w:i/>
+                <w:lang w:val="en-PK"/>
+              </w:rPr>
+            </w:pPr>
+            <w:r>
+              <w:rPr>
+                <w:rFonts w:ascii="Arial" w:hAnsi="Arial" w:cs="Arial"/>
+                <w:i/>
+                <w:lang w:val="en-PK"/>
+              </w:rPr>
+              <w:t>            case _:</w:t>
+            </w:r>
+          </w:p>
+          <w:p>
+            <w:pPr>
+              <w:spacing w:after="0" w:line="240" w:lineRule="auto"/>
+              <w:rPr>
+                <w:rFonts w:ascii="Arial" w:hAnsi="Arial" w:cs="Arial"/>
+                <w:i/>
+                <w:lang w:val="en-PK"/>
+              </w:rPr>
+            </w:pPr>
+            <w:r>
+              <w:rPr>
+                <w:rFonts w:ascii="Arial" w:hAnsi="Arial" w:cs="Arial"/>
+                <w:i/>
+                <w:lang w:val="en-PK"/>
+              </w:rPr>
+              <w:t>                return 0</w:t>
+            </w:r>
           </w:p>
           <w:p>
             <w:pPr>
@@ -4992,86 +4500,575 @@
               <w:rPr>
                 <w:rFonts w:ascii="Arial" w:hAnsi="Arial" w:cs="Arial"/>
                 <w:i/>
-              </w:rPr>
-            </w:pPr>
-            <w:r>
-              <w:rPr>
-                <w:rFonts w:ascii="Arial" w:hAnsi="Arial" w:cs="Arial"/>
-                <w:i/>
-              </w:rPr>
-              <w:t>{Copy and paste program code listing for question 3(</w:t>
-            </w:r>
-            <w:r>
-              <w:rPr>
-                <w:rFonts w:ascii="Arial" w:hAnsi="Arial" w:cs="Arial"/>
-                <w:i/>
-              </w:rPr>
-              <w:t>c</w:t>
-            </w:r>
-            <w:r>
-              <w:rPr>
-                <w:rFonts w:ascii="Arial" w:hAnsi="Arial" w:cs="Arial"/>
-                <w:i/>
-              </w:rPr>
-              <w:t>)(i</w:t>
-            </w:r>
-            <w:r>
-              <w:rPr>
-                <w:rFonts w:ascii="Arial" w:hAnsi="Arial" w:cs="Arial"/>
-                <w:i/>
-              </w:rPr>
-              <w:t>v</w:t>
-            </w:r>
-            <w:r>
-              <w:rPr>
-                <w:rFonts w:ascii="Arial" w:hAnsi="Arial" w:cs="Arial"/>
-                <w:i/>
-              </w:rPr>
-              <w:t>) here}</w:t>
-            </w:r>
-          </w:p>
-          <w:p>
-            <w:pPr>
-              <w:spacing w:after="0" w:line="240" w:lineRule="auto"/>
-              <w:rPr>
-                <w:rFonts w:ascii="Arial" w:hAnsi="Arial" w:cs="Arial"/>
-                <w:i/>
-              </w:rPr>
-            </w:pPr>
-          </w:p>
-          <w:p>
-            <w:pPr>
-              <w:spacing w:after="0" w:line="240" w:lineRule="auto"/>
-              <w:rPr>
-                <w:rFonts w:ascii="Arial" w:hAnsi="Arial" w:cs="Arial"/>
-                <w:i/>
-              </w:rPr>
-            </w:pPr>
-          </w:p>
-          <w:p>
-            <w:pPr>
-              <w:spacing w:after="0" w:line="240" w:lineRule="auto"/>
-              <w:rPr>
-                <w:rFonts w:ascii="Arial" w:hAnsi="Arial" w:cs="Arial"/>
-                <w:i/>
-              </w:rPr>
-            </w:pPr>
-          </w:p>
-          <w:p>
-            <w:pPr>
-              <w:spacing w:after="0" w:line="240" w:lineRule="auto"/>
-              <w:rPr>
-                <w:rFonts w:ascii="Arial" w:hAnsi="Arial" w:cs="Arial"/>
-                <w:i/>
-              </w:rPr>
-            </w:pPr>
-          </w:p>
-          <w:p>
-            <w:pPr>
-              <w:spacing w:after="0" w:line="240" w:lineRule="auto"/>
-              <w:rPr>
-                <w:rFonts w:ascii="Arial" w:hAnsi="Arial" w:cs="Arial"/>
-                <w:i/>
+                <w:lang w:val="en-PK"/>
+              </w:rPr>
+            </w:pPr>
+            <w:r>
+              <w:rPr>
+                <w:rFonts w:ascii="Arial" w:hAnsi="Arial" w:cs="Arial"/>
+                <w:i/>
+                <w:lang w:val="en-PK"/>
+              </w:rPr>
+              <w:t xml:space="preserve">def </w:t>
+            </w:r>
+            <w:proofErr w:type="gramStart"/>
+            <w:r>
+              <w:rPr>
+                <w:rFonts w:ascii="Arial" w:hAnsi="Arial" w:cs="Arial"/>
+                <w:i/>
+                <w:lang w:val="en-PK"/>
+              </w:rPr>
+              <w:t>main(</w:t>
+            </w:r>
+            <w:proofErr w:type="gramEnd"/>
+            <w:r>
+              <w:rPr>
+                <w:rFonts w:ascii="Arial" w:hAnsi="Arial" w:cs="Arial"/>
+                <w:i/>
+                <w:lang w:val="en-PK"/>
+              </w:rPr>
+              <w:t>):</w:t>
+            </w:r>
+          </w:p>
+          <w:p>
+            <w:pPr>
+              <w:spacing w:after="0" w:line="240" w:lineRule="auto"/>
+              <w:rPr>
+                <w:rFonts w:ascii="Arial" w:hAnsi="Arial" w:cs="Arial"/>
+                <w:i/>
+                <w:lang w:val="en-PK"/>
+              </w:rPr>
+            </w:pPr>
+            <w:r>
+              <w:rPr>
+                <w:rFonts w:ascii="Arial" w:hAnsi="Arial" w:cs="Arial"/>
+                <w:i/>
+                <w:lang w:val="en-PK"/>
+              </w:rPr>
+              <w:t xml:space="preserve">    </w:t>
+            </w:r>
+            <w:proofErr w:type="gramStart"/>
+            <w:r>
+              <w:rPr>
+                <w:rFonts w:ascii="Arial" w:hAnsi="Arial" w:cs="Arial"/>
+                <w:i/>
+                <w:lang w:val="en-PK"/>
+              </w:rPr>
+              <w:t>readData(</w:t>
+            </w:r>
+            <w:proofErr w:type="gramEnd"/>
+            <w:r>
+              <w:rPr>
+                <w:rFonts w:ascii="Arial" w:hAnsi="Arial" w:cs="Arial"/>
+                <w:i/>
+                <w:lang w:val="en-PK"/>
+              </w:rPr>
+              <w:t>)</w:t>
+            </w:r>
+          </w:p>
+          <w:p>
+            <w:pPr>
+              <w:spacing w:after="0" w:line="240" w:lineRule="auto"/>
+              <w:rPr>
+                <w:rFonts w:ascii="Arial" w:hAnsi="Arial" w:cs="Arial"/>
+                <w:i/>
+                <w:lang w:val="en-PK"/>
+              </w:rPr>
+            </w:pPr>
+            <w:r>
+              <w:rPr>
+                <w:rFonts w:ascii="Arial" w:hAnsi="Arial" w:cs="Arial"/>
+                <w:i/>
+                <w:lang w:val="en-PK"/>
+              </w:rPr>
+              <w:t>    numAttempt = 1</w:t>
+            </w:r>
+          </w:p>
+          <w:p>
+            <w:pPr>
+              <w:spacing w:after="0" w:line="240" w:lineRule="auto"/>
+              <w:rPr>
+                <w:rFonts w:ascii="Arial" w:hAnsi="Arial" w:cs="Arial"/>
+                <w:i/>
+                <w:lang w:val="en-PK"/>
+              </w:rPr>
+            </w:pPr>
+            <w:r>
+              <w:rPr>
+                <w:rFonts w:ascii="Arial" w:hAnsi="Arial" w:cs="Arial"/>
+                <w:i/>
+                <w:lang w:val="en-PK"/>
+              </w:rPr>
+              <w:t xml:space="preserve">    # question = </w:t>
+            </w:r>
+            <w:proofErr w:type="gramStart"/>
+            <w:r>
+              <w:rPr>
+                <w:rFonts w:ascii="Arial" w:hAnsi="Arial" w:cs="Arial"/>
+                <w:i/>
+                <w:lang w:val="en-PK"/>
+              </w:rPr>
+              <w:t>readData(</w:t>
+            </w:r>
+            <w:proofErr w:type="gramEnd"/>
+            <w:r>
+              <w:rPr>
+                <w:rFonts w:ascii="Arial" w:hAnsi="Arial" w:cs="Arial"/>
+                <w:i/>
+                <w:lang w:val="en-PK"/>
+              </w:rPr>
+              <w:t>)</w:t>
+            </w:r>
+          </w:p>
+          <w:p>
+            <w:pPr>
+              <w:spacing w:after="0" w:line="240" w:lineRule="auto"/>
+              <w:rPr>
+                <w:rFonts w:ascii="Arial" w:hAnsi="Arial" w:cs="Arial"/>
+                <w:i/>
+                <w:lang w:val="en-PK"/>
+              </w:rPr>
+            </w:pPr>
+            <w:r>
+              <w:rPr>
+                <w:rFonts w:ascii="Arial" w:hAnsi="Arial" w:cs="Arial"/>
+                <w:i/>
+                <w:lang w:val="en-PK"/>
+              </w:rPr>
+              <w:t xml:space="preserve">    qNum = </w:t>
+            </w:r>
+            <w:proofErr w:type="gramStart"/>
+            <w:r>
+              <w:rPr>
+                <w:rFonts w:ascii="Arial" w:hAnsi="Arial" w:cs="Arial"/>
+                <w:i/>
+                <w:lang w:val="en-PK"/>
+              </w:rPr>
+              <w:t>int(input(</w:t>
+            </w:r>
+            <w:proofErr w:type="gramEnd"/>
+            <w:r>
+              <w:rPr>
+                <w:rFonts w:ascii="Arial" w:hAnsi="Arial" w:cs="Arial"/>
+                <w:i/>
+                <w:lang w:val="en-PK"/>
+              </w:rPr>
+              <w:t>"Enter the question number between 1 and 5: "))</w:t>
+            </w:r>
+          </w:p>
+          <w:p>
+            <w:pPr>
+              <w:spacing w:after="0" w:line="240" w:lineRule="auto"/>
+              <w:rPr>
+                <w:rFonts w:ascii="Arial" w:hAnsi="Arial" w:cs="Arial"/>
+                <w:i/>
+                <w:lang w:val="en-PK"/>
+              </w:rPr>
+            </w:pPr>
+            <w:r>
+              <w:rPr>
+                <w:rFonts w:ascii="Arial" w:hAnsi="Arial" w:cs="Arial"/>
+                <w:i/>
+                <w:lang w:val="en-PK"/>
+              </w:rPr>
+              <w:t>    while qNum &gt; 6 or qNum &lt; 0:</w:t>
+            </w:r>
+          </w:p>
+          <w:p>
+            <w:pPr>
+              <w:spacing w:after="0" w:line="240" w:lineRule="auto"/>
+              <w:rPr>
+                <w:rFonts w:ascii="Arial" w:hAnsi="Arial" w:cs="Arial"/>
+                <w:i/>
+                <w:lang w:val="en-PK"/>
+              </w:rPr>
+            </w:pPr>
+            <w:r>
+              <w:rPr>
+                <w:rFonts w:ascii="Arial" w:hAnsi="Arial" w:cs="Arial"/>
+                <w:i/>
+                <w:lang w:val="en-PK"/>
+              </w:rPr>
+              <w:t xml:space="preserve">        qNum = </w:t>
+            </w:r>
+            <w:proofErr w:type="gramStart"/>
+            <w:r>
+              <w:rPr>
+                <w:rFonts w:ascii="Arial" w:hAnsi="Arial" w:cs="Arial"/>
+                <w:i/>
+                <w:lang w:val="en-PK"/>
+              </w:rPr>
+              <w:t>int(input(</w:t>
+            </w:r>
+            <w:proofErr w:type="gramEnd"/>
+            <w:r>
+              <w:rPr>
+                <w:rFonts w:ascii="Arial" w:hAnsi="Arial" w:cs="Arial"/>
+                <w:i/>
+                <w:lang w:val="en-PK"/>
+              </w:rPr>
+              <w:t>"Please Enter the question number between 1 and 5: "))</w:t>
+            </w:r>
+          </w:p>
+          <w:p>
+            <w:pPr>
+              <w:spacing w:after="0" w:line="240" w:lineRule="auto"/>
+              <w:rPr>
+                <w:rFonts w:ascii="Arial" w:hAnsi="Arial" w:cs="Arial"/>
+                <w:i/>
+                <w:lang w:val="en-PK"/>
+              </w:rPr>
+            </w:pPr>
+            <w:r>
+              <w:rPr>
+                <w:rFonts w:ascii="Arial" w:hAnsi="Arial" w:cs="Arial"/>
+                <w:i/>
+                <w:lang w:val="en-PK"/>
+              </w:rPr>
+              <w:t xml:space="preserve">    question = </w:t>
+            </w:r>
+            <w:proofErr w:type="gramStart"/>
+            <w:r>
+              <w:rPr>
+                <w:rFonts w:ascii="Arial" w:hAnsi="Arial" w:cs="Arial"/>
+                <w:i/>
+                <w:lang w:val="en-PK"/>
+              </w:rPr>
+              <w:t>int(input(</w:t>
+            </w:r>
+            <w:proofErr w:type="gramEnd"/>
+            <w:r>
+              <w:rPr>
+                <w:rFonts w:ascii="Arial" w:hAnsi="Arial" w:cs="Arial"/>
+                <w:i/>
+                <w:lang w:val="en-PK"/>
+              </w:rPr>
+              <w:t>f"What is {arrayTreasure[qNum-1</w:t>
+            </w:r>
+            <w:proofErr w:type="gramStart"/>
+            <w:r>
+              <w:rPr>
+                <w:rFonts w:ascii="Arial" w:hAnsi="Arial" w:cs="Arial"/>
+                <w:i/>
+                <w:lang w:val="en-PK"/>
+              </w:rPr>
+              <w:t>].getQuestion</w:t>
+            </w:r>
+            <w:proofErr w:type="gramEnd"/>
+            <w:r>
+              <w:rPr>
+                <w:rFonts w:ascii="Arial" w:hAnsi="Arial" w:cs="Arial"/>
+                <w:i/>
+                <w:lang w:val="en-PK"/>
+              </w:rPr>
+              <w:t>()}: "))</w:t>
+            </w:r>
+          </w:p>
+          <w:p>
+            <w:pPr>
+              <w:spacing w:after="0" w:line="240" w:lineRule="auto"/>
+              <w:rPr>
+                <w:rFonts w:ascii="Arial" w:hAnsi="Arial" w:cs="Arial"/>
+                <w:i/>
+                <w:lang w:val="en-PK"/>
+              </w:rPr>
+            </w:pPr>
+            <w:r>
+              <w:rPr>
+                <w:rFonts w:ascii="Arial" w:hAnsi="Arial" w:cs="Arial"/>
+                <w:i/>
+                <w:lang w:val="en-PK"/>
+              </w:rPr>
+              <w:t xml:space="preserve">    answer = </w:t>
+            </w:r>
+            <w:proofErr w:type="gramStart"/>
+            <w:r>
+              <w:rPr>
+                <w:rFonts w:ascii="Arial" w:hAnsi="Arial" w:cs="Arial"/>
+                <w:i/>
+                <w:lang w:val="en-PK"/>
+              </w:rPr>
+              <w:t>arrayTreasure[</w:t>
+            </w:r>
+            <w:proofErr w:type="gramEnd"/>
+            <w:r>
+              <w:rPr>
+                <w:rFonts w:ascii="Arial" w:hAnsi="Arial" w:cs="Arial"/>
+                <w:i/>
+                <w:lang w:val="en-PK"/>
+              </w:rPr>
+              <w:t>qNum - 1</w:t>
+            </w:r>
+            <w:proofErr w:type="gramStart"/>
+            <w:r>
+              <w:rPr>
+                <w:rFonts w:ascii="Arial" w:hAnsi="Arial" w:cs="Arial"/>
+                <w:i/>
+                <w:lang w:val="en-PK"/>
+              </w:rPr>
+              <w:t>].checkAnswer</w:t>
+            </w:r>
+            <w:proofErr w:type="gramEnd"/>
+            <w:r>
+              <w:rPr>
+                <w:rFonts w:ascii="Arial" w:hAnsi="Arial" w:cs="Arial"/>
+                <w:i/>
+                <w:lang w:val="en-PK"/>
+              </w:rPr>
+              <w:t>(question)</w:t>
+            </w:r>
+          </w:p>
+          <w:p>
+            <w:pPr>
+              <w:spacing w:after="0" w:line="240" w:lineRule="auto"/>
+              <w:rPr>
+                <w:rFonts w:ascii="Arial" w:hAnsi="Arial" w:cs="Arial"/>
+                <w:i/>
+                <w:lang w:val="en-PK"/>
+              </w:rPr>
+            </w:pPr>
+            <w:r>
+              <w:rPr>
+                <w:rFonts w:ascii="Arial" w:hAnsi="Arial" w:cs="Arial"/>
+                <w:i/>
+                <w:lang w:val="en-PK"/>
+              </w:rPr>
+              <w:t>    while not answer:</w:t>
+            </w:r>
+          </w:p>
+          <w:p>
+            <w:pPr>
+              <w:spacing w:after="0" w:line="240" w:lineRule="auto"/>
+              <w:rPr>
+                <w:rFonts w:ascii="Arial" w:hAnsi="Arial" w:cs="Arial"/>
+                <w:i/>
+                <w:lang w:val="en-PK"/>
+              </w:rPr>
+            </w:pPr>
+            <w:r>
+              <w:rPr>
+                <w:rFonts w:ascii="Arial" w:hAnsi="Arial" w:cs="Arial"/>
+                <w:i/>
+                <w:lang w:val="en-PK"/>
+              </w:rPr>
+              <w:t xml:space="preserve">        answer = </w:t>
+            </w:r>
+            <w:proofErr w:type="gramStart"/>
+            <w:r>
+              <w:rPr>
+                <w:rFonts w:ascii="Arial" w:hAnsi="Arial" w:cs="Arial"/>
+                <w:i/>
+                <w:lang w:val="en-PK"/>
+              </w:rPr>
+              <w:t>arrayTreasure[</w:t>
+            </w:r>
+            <w:proofErr w:type="gramEnd"/>
+            <w:r>
+              <w:rPr>
+                <w:rFonts w:ascii="Arial" w:hAnsi="Arial" w:cs="Arial"/>
+                <w:i/>
+                <w:lang w:val="en-PK"/>
+              </w:rPr>
+              <w:t>qNum - 1</w:t>
+            </w:r>
+            <w:proofErr w:type="gramStart"/>
+            <w:r>
+              <w:rPr>
+                <w:rFonts w:ascii="Arial" w:hAnsi="Arial" w:cs="Arial"/>
+                <w:i/>
+                <w:lang w:val="en-PK"/>
+              </w:rPr>
+              <w:t>].checkAnswer</w:t>
+            </w:r>
+            <w:proofErr w:type="gramEnd"/>
+            <w:r>
+              <w:rPr>
+                <w:rFonts w:ascii="Arial" w:hAnsi="Arial" w:cs="Arial"/>
+                <w:i/>
+                <w:lang w:val="en-PK"/>
+              </w:rPr>
+              <w:t>(</w:t>
+            </w:r>
+          </w:p>
+          <w:p>
+            <w:pPr>
+              <w:spacing w:after="0" w:line="240" w:lineRule="auto"/>
+              <w:rPr>
+                <w:rFonts w:ascii="Arial" w:hAnsi="Arial" w:cs="Arial"/>
+                <w:i/>
+                <w:lang w:val="en-PK"/>
+              </w:rPr>
+            </w:pPr>
+            <w:r>
+              <w:rPr>
+                <w:rFonts w:ascii="Arial" w:hAnsi="Arial" w:cs="Arial"/>
+                <w:i/>
+                <w:lang w:val="en-PK"/>
+              </w:rPr>
+              <w:t xml:space="preserve">            </w:t>
+            </w:r>
+            <w:proofErr w:type="gramStart"/>
+            <w:r>
+              <w:rPr>
+                <w:rFonts w:ascii="Arial" w:hAnsi="Arial" w:cs="Arial"/>
+                <w:i/>
+                <w:lang w:val="en-PK"/>
+              </w:rPr>
+              <w:t>int(input(</w:t>
+            </w:r>
+            <w:proofErr w:type="gramEnd"/>
+            <w:r>
+              <w:rPr>
+                <w:rFonts w:ascii="Arial" w:hAnsi="Arial" w:cs="Arial"/>
+                <w:i/>
+                <w:lang w:val="en-PK"/>
+              </w:rPr>
+              <w:t xml:space="preserve">"WRONG ANSWER! Re-Enter the answer </w:t>
+            </w:r>
+            <w:proofErr w:type="gramStart"/>
+            <w:r>
+              <w:rPr>
+                <w:rFonts w:ascii="Arial" w:hAnsi="Arial" w:cs="Arial"/>
+                <w:i/>
+                <w:lang w:val="en-PK"/>
+              </w:rPr>
+              <w:t>of</w:t>
+            </w:r>
+            <w:proofErr w:type="gramEnd"/>
+            <w:r>
+              <w:rPr>
+                <w:rFonts w:ascii="Arial" w:hAnsi="Arial" w:cs="Arial"/>
+                <w:i/>
+                <w:lang w:val="en-PK"/>
+              </w:rPr>
+              <w:t xml:space="preserve"> the question: "))</w:t>
+            </w:r>
+          </w:p>
+          <w:p>
+            <w:pPr>
+              <w:spacing w:after="0" w:line="240" w:lineRule="auto"/>
+              <w:rPr>
+                <w:rFonts w:ascii="Arial" w:hAnsi="Arial" w:cs="Arial"/>
+                <w:i/>
+                <w:lang w:val="en-PK"/>
+              </w:rPr>
+            </w:pPr>
+            <w:r>
+              <w:rPr>
+                <w:rFonts w:ascii="Arial" w:hAnsi="Arial" w:cs="Arial"/>
+                <w:i/>
+                <w:lang w:val="en-PK"/>
+              </w:rPr>
+              <w:t>        )</w:t>
+            </w:r>
+          </w:p>
+          <w:p>
+            <w:pPr>
+              <w:spacing w:after="0" w:line="240" w:lineRule="auto"/>
+              <w:rPr>
+                <w:rFonts w:ascii="Arial" w:hAnsi="Arial" w:cs="Arial"/>
+                <w:i/>
+                <w:lang w:val="en-PK"/>
+              </w:rPr>
+            </w:pPr>
+            <w:r>
+              <w:rPr>
+                <w:rFonts w:ascii="Arial" w:hAnsi="Arial" w:cs="Arial"/>
+                <w:i/>
+                <w:lang w:val="en-PK"/>
+              </w:rPr>
+              <w:t>        numAttempt += 1</w:t>
+            </w:r>
+          </w:p>
+          <w:p>
+            <w:pPr>
+              <w:spacing w:after="0" w:line="240" w:lineRule="auto"/>
+              <w:rPr>
+                <w:rFonts w:ascii="Arial" w:hAnsi="Arial" w:cs="Arial"/>
+                <w:i/>
+                <w:lang w:val="en-PK"/>
+              </w:rPr>
+            </w:pPr>
+          </w:p>
+          <w:p>
+            <w:pPr>
+              <w:spacing w:after="0" w:line="240" w:lineRule="auto"/>
+              <w:rPr>
+                <w:rFonts w:ascii="Arial" w:hAnsi="Arial" w:cs="Arial"/>
+                <w:i/>
+                <w:lang w:val="en-PK"/>
+              </w:rPr>
+            </w:pPr>
+            <w:r>
+              <w:rPr>
+                <w:rFonts w:ascii="Arial" w:hAnsi="Arial" w:cs="Arial"/>
+                <w:i/>
+                <w:lang w:val="en-PK"/>
+              </w:rPr>
+              <w:t xml:space="preserve">    </w:t>
+            </w:r>
+            <w:proofErr w:type="gramStart"/>
+            <w:r>
+              <w:rPr>
+                <w:rFonts w:ascii="Arial" w:hAnsi="Arial" w:cs="Arial"/>
+                <w:i/>
+                <w:lang w:val="en-PK"/>
+              </w:rPr>
+              <w:t>print(</w:t>
+            </w:r>
+            <w:proofErr w:type="gramEnd"/>
+            <w:r>
+              <w:rPr>
+                <w:rFonts w:ascii="Arial" w:hAnsi="Arial" w:cs="Arial"/>
+                <w:i/>
+                <w:lang w:val="en-PK"/>
+              </w:rPr>
+              <w:t>f"Your Points: {</w:t>
+            </w:r>
+            <w:proofErr w:type="gramStart"/>
+            <w:r>
+              <w:rPr>
+                <w:rFonts w:ascii="Arial" w:hAnsi="Arial" w:cs="Arial"/>
+                <w:i/>
+                <w:lang w:val="en-PK"/>
+              </w:rPr>
+              <w:t>arrayTreasure[</w:t>
+            </w:r>
+            <w:proofErr w:type="gramEnd"/>
+            <w:r>
+              <w:rPr>
+                <w:rFonts w:ascii="Arial" w:hAnsi="Arial" w:cs="Arial"/>
+                <w:i/>
+                <w:lang w:val="en-PK"/>
+              </w:rPr>
+              <w:t>qNum - 1</w:t>
+            </w:r>
+            <w:proofErr w:type="gramStart"/>
+            <w:r>
+              <w:rPr>
+                <w:rFonts w:ascii="Arial" w:hAnsi="Arial" w:cs="Arial"/>
+                <w:i/>
+                <w:lang w:val="en-PK"/>
+              </w:rPr>
+              <w:t>].getPoints</w:t>
+            </w:r>
+            <w:proofErr w:type="gramEnd"/>
+            <w:r>
+              <w:rPr>
+                <w:rFonts w:ascii="Arial" w:hAnsi="Arial" w:cs="Arial"/>
+                <w:i/>
+                <w:lang w:val="en-PK"/>
+              </w:rPr>
+              <w:t>(numAttempt)}")</w:t>
+            </w:r>
+          </w:p>
+          <w:p>
+            <w:pPr>
+              <w:spacing w:after="0" w:line="240" w:lineRule="auto"/>
+              <w:rPr>
+                <w:rFonts w:ascii="Arial" w:hAnsi="Arial" w:cs="Arial"/>
+                <w:i/>
+                <w:lang w:val="en-PK"/>
               </w:rPr>
             </w:pPr>
           </w:p>
@@ -5134,7 +5131,6 @@
                 <w:sz w:val="28"/>
                 <w:szCs w:val="28"/>
               </w:rPr>
-              <w:lastRenderedPageBreak/>
               <w:t>Part 3(</w:t>
             </w:r>
             <w:r>
@@ -5187,111 +5183,52 @@
               <w:rPr>
                 <w:rFonts w:ascii="Arial" w:hAnsi="Arial" w:cs="Arial"/>
                 <w:i/>
-              </w:rPr>
-            </w:pPr>
-            <w:r>
-              <w:rPr>
-                <w:rFonts w:ascii="Arial" w:hAnsi="Arial" w:cs="Arial"/>
-                <w:i/>
-              </w:rPr>
-              <w:t xml:space="preserve">{Copy and paste </w:t>
-            </w:r>
-            <w:r>
-              <w:rPr>
-                <w:rFonts w:ascii="Arial" w:hAnsi="Arial" w:cs="Arial"/>
-                <w:i/>
-              </w:rPr>
-              <w:t>screenshot</w:t>
-            </w:r>
-            <w:r>
-              <w:rPr>
-                <w:rFonts w:ascii="Arial" w:hAnsi="Arial" w:cs="Arial"/>
-                <w:i/>
-              </w:rPr>
-              <w:t>s</w:t>
-            </w:r>
-            <w:r>
-              <w:rPr>
-                <w:rFonts w:ascii="Arial" w:hAnsi="Arial" w:cs="Arial"/>
-                <w:i/>
-              </w:rPr>
-              <w:t xml:space="preserve"> of the two tests for question</w:t>
-            </w:r>
-            <w:r>
-              <w:rPr>
-                <w:rFonts w:ascii="Arial" w:hAnsi="Arial" w:cs="Arial"/>
-                <w:i/>
-              </w:rPr>
-              <w:t xml:space="preserve"> 3(</w:t>
-            </w:r>
-            <w:r>
-              <w:rPr>
-                <w:rFonts w:ascii="Arial" w:hAnsi="Arial" w:cs="Arial"/>
-                <w:i/>
-              </w:rPr>
-              <w:t>c)(v</w:t>
-            </w:r>
-            <w:r>
-              <w:rPr>
-                <w:rFonts w:ascii="Arial" w:hAnsi="Arial" w:cs="Arial"/>
-                <w:i/>
-              </w:rPr>
-              <w:t>) here}</w:t>
-            </w:r>
-          </w:p>
-          <w:p>
-            <w:pPr>
-              <w:spacing w:after="0" w:line="240" w:lineRule="auto"/>
-              <w:rPr>
-                <w:rFonts w:ascii="Arial" w:hAnsi="Arial" w:cs="Arial"/>
-                <w:i/>
-              </w:rPr>
-            </w:pPr>
-          </w:p>
-          <w:p>
-            <w:pPr>
-              <w:spacing w:after="0" w:line="240" w:lineRule="auto"/>
-              <w:rPr>
-                <w:rFonts w:ascii="Arial" w:hAnsi="Arial" w:cs="Arial"/>
-                <w:i/>
-              </w:rPr>
-            </w:pPr>
-          </w:p>
-          <w:p>
-            <w:pPr>
-              <w:spacing w:after="0" w:line="240" w:lineRule="auto"/>
-              <w:rPr>
-                <w:rFonts w:ascii="Arial" w:hAnsi="Arial" w:cs="Arial"/>
-                <w:i/>
-              </w:rPr>
-            </w:pPr>
-          </w:p>
-          <w:p>
-            <w:pPr>
-              <w:spacing w:after="0" w:line="240" w:lineRule="auto"/>
-              <w:rPr>
-                <w:rFonts w:ascii="Arial" w:hAnsi="Arial" w:cs="Arial"/>
-                <w:i/>
-              </w:rPr>
-            </w:pPr>
-          </w:p>
-          <w:p>
-            <w:pPr>
-              <w:spacing w:after="0" w:line="240" w:lineRule="auto"/>
-              <w:rPr>
-                <w:rFonts w:ascii="Arial" w:hAnsi="Arial" w:cs="Arial"/>
-                <w:i/>
-              </w:rPr>
-            </w:pPr>
-          </w:p>
-          <w:p>
-            <w:pPr>
-              <w:spacing w:after="0" w:line="240" w:lineRule="auto"/>
-              <w:rPr>
-                <w:rFonts w:ascii="Arial" w:hAnsi="Arial" w:cs="Arial"/>
-                <w:i/>
-              </w:rPr>
-            </w:pPr>
+                <w:noProof/>
+              </w:rPr>
+            </w:pPr>
+            <w:r>
+              <w:rPr>
+                <w:rFonts w:ascii="Arial" w:hAnsi="Arial" w:cs="Arial"/>
+                <w:i/>
+                <w:noProof/>
+              </w:rPr>
+              <w:pict w14:anchorId="2AFBFDD5">
+                <v:shape id="_x0000_i1031" type="#_x0000_t75" style="width:241.5pt;height:38.25pt;visibility:visible;mso-wrap-style:square">
+                  <v:imagedata r:id="rId10" o:title=""/>
+                </v:shape>
+              </w:pict>
+            </w:r>
+          </w:p>
+          <w:p>
+            <w:pPr>
+              <w:spacing w:after="0" w:line="240" w:lineRule="auto"/>
+              <w:rPr>
+                <w:rFonts w:ascii="Arial" w:hAnsi="Arial" w:cs="Arial"/>
+                <w:i/>
+                <w:noProof/>
+              </w:rPr>
+            </w:pPr>
+          </w:p>
+          <w:p>
+            <w:pPr>
+              <w:spacing w:after="0" w:line="240" w:lineRule="auto"/>
+              <w:rPr>
+                <w:rFonts w:ascii="Arial" w:hAnsi="Arial" w:cs="Arial"/>
+                <w:i/>
+              </w:rPr>
+            </w:pPr>
+            <w:r>
+              <w:rPr>
+                <w:rFonts w:ascii="Arial" w:hAnsi="Arial" w:cs="Arial"/>
+                <w:i/>
+                <w:noProof/>
+              </w:rPr>
+              <w:pict w14:anchorId="48FF4FBF">
+                <v:shape id="_x0000_i1036" type="#_x0000_t75" style="width:303pt;height:52.5pt;visibility:visible;mso-wrap-style:square">
+                  <v:imagedata r:id="rId11" o:title=""/>
+                </v:shape>
+              </w:pict>
+            </w:r>
           </w:p>
         </w:tc>
       </w:tr>
@@ -5313,8 +5250,8 @@
       </w:pPr>
     </w:p>
     <w:sectPr>
-      <w:headerReference w:type="default" r:id="rId10"/>
-      <w:footerReference w:type="default" r:id="rId11"/>
+      <w:headerReference w:type="default" r:id="rId12"/>
+      <w:footerReference w:type="default" r:id="rId13"/>
       <w:pgSz w:w="11906" w:h="16838" w:code="9"/>
       <w:pgMar w:top="709" w:right="1134" w:bottom="1134" w:left="1134" w:header="709" w:footer="709" w:gutter="0"/>
       <w:cols w:space="708"/>

</xml_diff>